<commit_message>
Restore the demographic table as Table 1 and renumber
- Reinstate the demographic and metaverse engagement table (N = 312) exactly as originally
  reported, with no value changes
- Remove the duplicating percentage recital from 5.1, leaving one interpretive sentence that
  points to Table 1, so the table is the single location for these figures
- Renumber: Table 1 demographics (5.1), Table 2 measurement model (5.2), Table 3 fsQCA
  necessity/sufficiency (5.3.1); all in-text cross-references updated
- Drop the unverifiable 60.58% usage claim; Table 1 now carries the frequency distribution
- Flag that the income percentages contradict their counts (57/312 = 18.27% not 18.40%;
  75/312 = 24.04% not 23.91%)

Submission count: 7,687 words (3 tables + 3 figures).
</commit_message>
<xml_diff>
--- a/JCM_Manuscript_Revised.docx
+++ b/JCM_Manuscript_Revised.docx
@@ -1523,25 +1523,7 @@
         <w:rPr>
           <w:color w:val="000000" w:themeColor="text1"/>
         </w:rPr>
-        <w:t>Descriptive analysis (IBM SPSS 25.0) profiled the 312 respondents: 143 men (46%) and 169 women (54%), distributed across five age bands from 18 to 45 years, the largest aged 23–28 (24.04%). In terms of marital status, 34.29% were single, 38.78% married without children and 26.93% married with children; occupationally, 39.10% were in business, 32.69% in salaried employment and 28.21% students. Monthly family income clustered in the INR 50,001–80,000 (32.05%) and INR 30,001–50,000 (25.64%) bands.</w:t>
-      </w:r>
-    </w:p>
-    <w:p>
-      <w:pPr>
-        <w:spacing w:line="360" w:lineRule="auto"/>
-        <w:ind w:firstLine="426"/>
-        <w:jc w:val="both"/>
-        <w:rPr>
-          <w:i/>
-          <w:iCs/>
-          <w:color w:val="000000" w:themeColor="text1"/>
-        </w:rPr>
-      </w:pPr>
-      <w:r>
-        <w:rPr>
-          <w:color w:val="000000" w:themeColor="text1"/>
-        </w:rPr>
-        <w:t>Engagement was substantial: 16.67% of respondents used the metaverse daily, 31.41% several times a week and 23.38% weekly, while 45.19% traded NFTs, 52.56% engaged in social interaction or content creation and 41.35% attended virtual events—activities central to brand engagement.</w:t>
+        <w:t>Table 1 profiles the 312 respondents (IBM SPSS 25.0). The sample is balanced by gender and spread across five age bands from 18 to 45 years, and most respondents report frequent metaverse use together with prior participation in NFT trading, social interaction or content creation, and virtual events—activities central to brand engagement.</w:t>
       </w:r>
     </w:p>
     <w:p>
@@ -1574,9 +1556,3631 @@
           <w:iCs/>
           <w:color w:val="000000" w:themeColor="text1"/>
         </w:rPr>
-        <w:t>5.2 Measurement model assessment</w:t>
-      </w:r>
-    </w:p>
+        <w:t>Table 1. Demographic and metaverse engagement details of respondents (N = 312)</w:t>
+      </w:r>
+    </w:p>
+    <w:tbl>
+      <w:tblPr>
+        <w:tblStyle w:val="TableGrid"/>
+        <w:tblW w:w="0" w:type="auto"/>
+        <w:jc w:val="center"/>
+        <w:tblLook w:val="04A0" w:firstRow="1" w:lastRow="0" w:firstColumn="1" w:lastColumn="0" w:noHBand="0" w:noVBand="1"/>
+      </w:tblPr>
+      <w:tblGrid>
+        <w:gridCol w:w="1657"/>
+        <w:gridCol w:w="1420"/>
+        <w:gridCol w:w="1093"/>
+        <w:gridCol w:w="2333"/>
+        <w:gridCol w:w="1420"/>
+        <w:gridCol w:w="1093"/>
+      </w:tblGrid>
+      <w:tr>
+        <w:trPr>
+          <w:jc w:val="center"/>
+        </w:trPr>
+        <w:tc>
+          <w:tcPr>
+            <w:tcW w:w="0" w:type="auto"/>
+            <w:hideMark/>
+          </w:tcPr>
+          <w:p>
+            <w:pPr>
+              <w:jc w:val="both"/>
+              <w:rPr>
+                <w:b/>
+                <w:bCs/>
+                <w:i/>
+                <w:iCs/>
+                <w:color w:val="000000" w:themeColor="text1"/>
+                <w:sz w:val="20"/>
+                <w:szCs w:val="20"/>
+              </w:rPr>
+            </w:pPr>
+            <w:r>
+              <w:rPr>
+                <w:b/>
+                <w:bCs/>
+                <w:i/>
+                <w:iCs/>
+                <w:color w:val="000000" w:themeColor="text1"/>
+                <w:sz w:val="20"/>
+                <w:szCs w:val="20"/>
+              </w:rPr>
+              <w:t>Participants' Information</w:t>
+            </w:r>
+          </w:p>
+        </w:tc>
+        <w:tc>
+          <w:tcPr>
+            <w:tcW w:w="0" w:type="auto"/>
+            <w:hideMark/>
+          </w:tcPr>
+          <w:p>
+            <w:pPr>
+              <w:jc w:val="both"/>
+              <w:rPr>
+                <w:b/>
+                <w:bCs/>
+                <w:i/>
+                <w:iCs/>
+                <w:color w:val="000000" w:themeColor="text1"/>
+                <w:sz w:val="20"/>
+                <w:szCs w:val="20"/>
+              </w:rPr>
+            </w:pPr>
+            <w:r>
+              <w:rPr>
+                <w:b/>
+                <w:bCs/>
+                <w:i/>
+                <w:iCs/>
+                <w:color w:val="000000" w:themeColor="text1"/>
+                <w:sz w:val="20"/>
+                <w:szCs w:val="20"/>
+              </w:rPr>
+              <w:t>No. of Participants</w:t>
+            </w:r>
+          </w:p>
+        </w:tc>
+        <w:tc>
+          <w:tcPr>
+            <w:tcW w:w="0" w:type="auto"/>
+            <w:hideMark/>
+          </w:tcPr>
+          <w:p>
+            <w:pPr>
+              <w:ind w:firstLine="426"/>
+              <w:jc w:val="both"/>
+              <w:rPr>
+                <w:b/>
+                <w:bCs/>
+                <w:i/>
+                <w:iCs/>
+                <w:color w:val="000000" w:themeColor="text1"/>
+                <w:sz w:val="20"/>
+                <w:szCs w:val="20"/>
+              </w:rPr>
+            </w:pPr>
+            <w:r>
+              <w:rPr>
+                <w:b/>
+                <w:bCs/>
+                <w:i/>
+                <w:iCs/>
+                <w:color w:val="000000" w:themeColor="text1"/>
+                <w:sz w:val="20"/>
+                <w:szCs w:val="20"/>
+              </w:rPr>
+              <w:t>%</w:t>
+            </w:r>
+          </w:p>
+        </w:tc>
+        <w:tc>
+          <w:tcPr>
+            <w:tcW w:w="0" w:type="auto"/>
+            <w:hideMark/>
+          </w:tcPr>
+          <w:p>
+            <w:pPr>
+              <w:jc w:val="both"/>
+              <w:rPr>
+                <w:b/>
+                <w:bCs/>
+                <w:i/>
+                <w:iCs/>
+                <w:color w:val="000000" w:themeColor="text1"/>
+                <w:sz w:val="20"/>
+                <w:szCs w:val="20"/>
+              </w:rPr>
+            </w:pPr>
+            <w:r>
+              <w:rPr>
+                <w:b/>
+                <w:bCs/>
+                <w:i/>
+                <w:iCs/>
+                <w:color w:val="000000" w:themeColor="text1"/>
+                <w:sz w:val="20"/>
+                <w:szCs w:val="20"/>
+              </w:rPr>
+              <w:t>Participants' Information</w:t>
+            </w:r>
+          </w:p>
+        </w:tc>
+        <w:tc>
+          <w:tcPr>
+            <w:tcW w:w="0" w:type="auto"/>
+            <w:hideMark/>
+          </w:tcPr>
+          <w:p>
+            <w:pPr>
+              <w:jc w:val="both"/>
+              <w:rPr>
+                <w:b/>
+                <w:bCs/>
+                <w:i/>
+                <w:iCs/>
+                <w:color w:val="000000" w:themeColor="text1"/>
+                <w:sz w:val="20"/>
+                <w:szCs w:val="20"/>
+              </w:rPr>
+            </w:pPr>
+            <w:r>
+              <w:rPr>
+                <w:b/>
+                <w:bCs/>
+                <w:i/>
+                <w:iCs/>
+                <w:color w:val="000000" w:themeColor="text1"/>
+                <w:sz w:val="20"/>
+                <w:szCs w:val="20"/>
+              </w:rPr>
+              <w:t>No. of Participants</w:t>
+            </w:r>
+          </w:p>
+        </w:tc>
+        <w:tc>
+          <w:tcPr>
+            <w:tcW w:w="0" w:type="auto"/>
+            <w:hideMark/>
+          </w:tcPr>
+          <w:p>
+            <w:pPr>
+              <w:ind w:firstLine="426"/>
+              <w:jc w:val="both"/>
+              <w:rPr>
+                <w:b/>
+                <w:bCs/>
+                <w:i/>
+                <w:iCs/>
+                <w:color w:val="000000" w:themeColor="text1"/>
+                <w:sz w:val="20"/>
+                <w:szCs w:val="20"/>
+              </w:rPr>
+            </w:pPr>
+            <w:r>
+              <w:rPr>
+                <w:b/>
+                <w:bCs/>
+                <w:i/>
+                <w:iCs/>
+                <w:color w:val="000000" w:themeColor="text1"/>
+                <w:sz w:val="20"/>
+                <w:szCs w:val="20"/>
+              </w:rPr>
+              <w:t>%</w:t>
+            </w:r>
+          </w:p>
+        </w:tc>
+      </w:tr>
+      <w:tr>
+        <w:trPr>
+          <w:jc w:val="center"/>
+        </w:trPr>
+        <w:tc>
+          <w:tcPr>
+            <w:tcW w:w="0" w:type="auto"/>
+            <w:hideMark/>
+          </w:tcPr>
+          <w:p>
+            <w:pPr>
+              <w:jc w:val="both"/>
+              <w:rPr>
+                <w:i/>
+                <w:iCs/>
+                <w:color w:val="000000" w:themeColor="text1"/>
+                <w:sz w:val="20"/>
+                <w:szCs w:val="20"/>
+              </w:rPr>
+            </w:pPr>
+            <w:r>
+              <w:rPr>
+                <w:b/>
+                <w:bCs/>
+                <w:i/>
+                <w:iCs/>
+                <w:color w:val="000000" w:themeColor="text1"/>
+                <w:sz w:val="20"/>
+                <w:szCs w:val="20"/>
+              </w:rPr>
+              <w:t>Gender</w:t>
+            </w:r>
+          </w:p>
+        </w:tc>
+        <w:tc>
+          <w:tcPr>
+            <w:tcW w:w="0" w:type="auto"/>
+            <w:hideMark/>
+          </w:tcPr>
+          <w:p>
+            <w:pPr>
+              <w:ind w:firstLine="426"/>
+              <w:jc w:val="both"/>
+              <w:rPr>
+                <w:i/>
+                <w:iCs/>
+                <w:color w:val="000000" w:themeColor="text1"/>
+                <w:sz w:val="20"/>
+                <w:szCs w:val="20"/>
+              </w:rPr>
+            </w:pPr>
+          </w:p>
+        </w:tc>
+        <w:tc>
+          <w:tcPr>
+            <w:tcW w:w="0" w:type="auto"/>
+            <w:hideMark/>
+          </w:tcPr>
+          <w:p>
+            <w:pPr>
+              <w:ind w:firstLine="426"/>
+              <w:jc w:val="right"/>
+              <w:rPr>
+                <w:i/>
+                <w:iCs/>
+                <w:color w:val="000000" w:themeColor="text1"/>
+                <w:sz w:val="20"/>
+                <w:szCs w:val="20"/>
+              </w:rPr>
+            </w:pPr>
+          </w:p>
+        </w:tc>
+        <w:tc>
+          <w:tcPr>
+            <w:tcW w:w="0" w:type="auto"/>
+            <w:hideMark/>
+          </w:tcPr>
+          <w:p>
+            <w:pPr>
+              <w:rPr>
+                <w:i/>
+                <w:iCs/>
+                <w:color w:val="000000" w:themeColor="text1"/>
+                <w:sz w:val="20"/>
+                <w:szCs w:val="20"/>
+              </w:rPr>
+            </w:pPr>
+            <w:r>
+              <w:rPr>
+                <w:b/>
+                <w:bCs/>
+                <w:i/>
+                <w:iCs/>
+                <w:color w:val="000000" w:themeColor="text1"/>
+                <w:sz w:val="20"/>
+                <w:szCs w:val="20"/>
+              </w:rPr>
+              <w:t>Metaverse Engagement Frequency</w:t>
+            </w:r>
+          </w:p>
+        </w:tc>
+        <w:tc>
+          <w:tcPr>
+            <w:tcW w:w="0" w:type="auto"/>
+            <w:hideMark/>
+          </w:tcPr>
+          <w:p>
+            <w:pPr>
+              <w:ind w:firstLine="426"/>
+              <w:jc w:val="both"/>
+              <w:rPr>
+                <w:i/>
+                <w:iCs/>
+                <w:color w:val="000000" w:themeColor="text1"/>
+                <w:sz w:val="20"/>
+                <w:szCs w:val="20"/>
+              </w:rPr>
+            </w:pPr>
+          </w:p>
+        </w:tc>
+        <w:tc>
+          <w:tcPr>
+            <w:tcW w:w="0" w:type="auto"/>
+            <w:hideMark/>
+          </w:tcPr>
+          <w:p>
+            <w:pPr>
+              <w:ind w:firstLine="426"/>
+              <w:jc w:val="both"/>
+              <w:rPr>
+                <w:i/>
+                <w:iCs/>
+                <w:color w:val="000000" w:themeColor="text1"/>
+                <w:sz w:val="20"/>
+                <w:szCs w:val="20"/>
+              </w:rPr>
+            </w:pPr>
+          </w:p>
+        </w:tc>
+      </w:tr>
+      <w:tr>
+        <w:trPr>
+          <w:jc w:val="center"/>
+        </w:trPr>
+        <w:tc>
+          <w:tcPr>
+            <w:tcW w:w="0" w:type="auto"/>
+            <w:hideMark/>
+          </w:tcPr>
+          <w:p>
+            <w:pPr>
+              <w:jc w:val="both"/>
+              <w:rPr>
+                <w:i/>
+                <w:iCs/>
+                <w:color w:val="000000" w:themeColor="text1"/>
+                <w:sz w:val="20"/>
+                <w:szCs w:val="20"/>
+              </w:rPr>
+            </w:pPr>
+            <w:r>
+              <w:rPr>
+                <w:i/>
+                <w:iCs/>
+                <w:color w:val="000000" w:themeColor="text1"/>
+                <w:sz w:val="20"/>
+                <w:szCs w:val="20"/>
+              </w:rPr>
+              <w:t>Male</w:t>
+            </w:r>
+          </w:p>
+        </w:tc>
+        <w:tc>
+          <w:tcPr>
+            <w:tcW w:w="0" w:type="auto"/>
+            <w:hideMark/>
+          </w:tcPr>
+          <w:p>
+            <w:pPr>
+              <w:ind w:firstLine="426"/>
+              <w:jc w:val="right"/>
+              <w:rPr>
+                <w:i/>
+                <w:iCs/>
+                <w:color w:val="000000" w:themeColor="text1"/>
+                <w:sz w:val="20"/>
+                <w:szCs w:val="20"/>
+              </w:rPr>
+            </w:pPr>
+            <w:r>
+              <w:rPr>
+                <w:i/>
+                <w:iCs/>
+                <w:color w:val="000000" w:themeColor="text1"/>
+                <w:sz w:val="20"/>
+                <w:szCs w:val="20"/>
+              </w:rPr>
+              <w:t>143</w:t>
+            </w:r>
+          </w:p>
+        </w:tc>
+        <w:tc>
+          <w:tcPr>
+            <w:tcW w:w="0" w:type="auto"/>
+            <w:hideMark/>
+          </w:tcPr>
+          <w:p>
+            <w:pPr>
+              <w:ind w:firstLine="426"/>
+              <w:jc w:val="right"/>
+              <w:rPr>
+                <w:i/>
+                <w:iCs/>
+                <w:color w:val="000000" w:themeColor="text1"/>
+                <w:sz w:val="20"/>
+                <w:szCs w:val="20"/>
+              </w:rPr>
+            </w:pPr>
+            <w:r>
+              <w:rPr>
+                <w:i/>
+                <w:iCs/>
+                <w:color w:val="000000" w:themeColor="text1"/>
+                <w:sz w:val="20"/>
+                <w:szCs w:val="20"/>
+              </w:rPr>
+              <w:t>46.00</w:t>
+            </w:r>
+          </w:p>
+        </w:tc>
+        <w:tc>
+          <w:tcPr>
+            <w:tcW w:w="0" w:type="auto"/>
+            <w:hideMark/>
+          </w:tcPr>
+          <w:p>
+            <w:pPr>
+              <w:rPr>
+                <w:i/>
+                <w:iCs/>
+                <w:color w:val="000000" w:themeColor="text1"/>
+                <w:sz w:val="20"/>
+                <w:szCs w:val="20"/>
+              </w:rPr>
+            </w:pPr>
+            <w:r>
+              <w:rPr>
+                <w:i/>
+                <w:iCs/>
+                <w:color w:val="000000" w:themeColor="text1"/>
+                <w:sz w:val="20"/>
+                <w:szCs w:val="20"/>
+              </w:rPr>
+              <w:t>Daily</w:t>
+            </w:r>
+          </w:p>
+        </w:tc>
+        <w:tc>
+          <w:tcPr>
+            <w:tcW w:w="0" w:type="auto"/>
+            <w:hideMark/>
+          </w:tcPr>
+          <w:p>
+            <w:pPr>
+              <w:ind w:firstLine="426"/>
+              <w:jc w:val="right"/>
+              <w:rPr>
+                <w:i/>
+                <w:iCs/>
+                <w:color w:val="000000" w:themeColor="text1"/>
+                <w:sz w:val="20"/>
+                <w:szCs w:val="20"/>
+              </w:rPr>
+            </w:pPr>
+            <w:r>
+              <w:rPr>
+                <w:i/>
+                <w:iCs/>
+                <w:color w:val="000000" w:themeColor="text1"/>
+                <w:sz w:val="20"/>
+                <w:szCs w:val="20"/>
+              </w:rPr>
+              <w:t>52</w:t>
+            </w:r>
+          </w:p>
+        </w:tc>
+        <w:tc>
+          <w:tcPr>
+            <w:tcW w:w="0" w:type="auto"/>
+            <w:hideMark/>
+          </w:tcPr>
+          <w:p>
+            <w:pPr>
+              <w:ind w:firstLine="426"/>
+              <w:jc w:val="right"/>
+              <w:rPr>
+                <w:i/>
+                <w:iCs/>
+                <w:color w:val="000000" w:themeColor="text1"/>
+                <w:sz w:val="20"/>
+                <w:szCs w:val="20"/>
+              </w:rPr>
+            </w:pPr>
+            <w:r>
+              <w:rPr>
+                <w:i/>
+                <w:iCs/>
+                <w:color w:val="000000" w:themeColor="text1"/>
+                <w:sz w:val="20"/>
+                <w:szCs w:val="20"/>
+              </w:rPr>
+              <w:t>16.67</w:t>
+            </w:r>
+          </w:p>
+        </w:tc>
+      </w:tr>
+      <w:tr>
+        <w:trPr>
+          <w:jc w:val="center"/>
+        </w:trPr>
+        <w:tc>
+          <w:tcPr>
+            <w:tcW w:w="0" w:type="auto"/>
+            <w:hideMark/>
+          </w:tcPr>
+          <w:p>
+            <w:pPr>
+              <w:jc w:val="both"/>
+              <w:rPr>
+                <w:i/>
+                <w:iCs/>
+                <w:color w:val="000000" w:themeColor="text1"/>
+                <w:sz w:val="20"/>
+                <w:szCs w:val="20"/>
+              </w:rPr>
+            </w:pPr>
+            <w:r>
+              <w:rPr>
+                <w:i/>
+                <w:iCs/>
+                <w:color w:val="000000" w:themeColor="text1"/>
+                <w:sz w:val="20"/>
+                <w:szCs w:val="20"/>
+              </w:rPr>
+              <w:t>Female</w:t>
+            </w:r>
+          </w:p>
+        </w:tc>
+        <w:tc>
+          <w:tcPr>
+            <w:tcW w:w="0" w:type="auto"/>
+            <w:hideMark/>
+          </w:tcPr>
+          <w:p>
+            <w:pPr>
+              <w:ind w:firstLine="426"/>
+              <w:jc w:val="right"/>
+              <w:rPr>
+                <w:i/>
+                <w:iCs/>
+                <w:color w:val="000000" w:themeColor="text1"/>
+                <w:sz w:val="20"/>
+                <w:szCs w:val="20"/>
+              </w:rPr>
+            </w:pPr>
+            <w:r>
+              <w:rPr>
+                <w:i/>
+                <w:iCs/>
+                <w:color w:val="000000" w:themeColor="text1"/>
+                <w:sz w:val="20"/>
+                <w:szCs w:val="20"/>
+              </w:rPr>
+              <w:t>169</w:t>
+            </w:r>
+          </w:p>
+        </w:tc>
+        <w:tc>
+          <w:tcPr>
+            <w:tcW w:w="0" w:type="auto"/>
+            <w:hideMark/>
+          </w:tcPr>
+          <w:p>
+            <w:pPr>
+              <w:ind w:firstLine="426"/>
+              <w:jc w:val="right"/>
+              <w:rPr>
+                <w:i/>
+                <w:iCs/>
+                <w:color w:val="000000" w:themeColor="text1"/>
+                <w:sz w:val="20"/>
+                <w:szCs w:val="20"/>
+              </w:rPr>
+            </w:pPr>
+            <w:r>
+              <w:rPr>
+                <w:i/>
+                <w:iCs/>
+                <w:color w:val="000000" w:themeColor="text1"/>
+                <w:sz w:val="20"/>
+                <w:szCs w:val="20"/>
+              </w:rPr>
+              <w:t>54.00</w:t>
+            </w:r>
+          </w:p>
+        </w:tc>
+        <w:tc>
+          <w:tcPr>
+            <w:tcW w:w="0" w:type="auto"/>
+            <w:hideMark/>
+          </w:tcPr>
+          <w:p>
+            <w:pPr>
+              <w:rPr>
+                <w:i/>
+                <w:iCs/>
+                <w:color w:val="000000" w:themeColor="text1"/>
+                <w:sz w:val="20"/>
+                <w:szCs w:val="20"/>
+              </w:rPr>
+            </w:pPr>
+            <w:r>
+              <w:rPr>
+                <w:i/>
+                <w:iCs/>
+                <w:color w:val="000000" w:themeColor="text1"/>
+                <w:sz w:val="20"/>
+                <w:szCs w:val="20"/>
+              </w:rPr>
+              <w:t>Several times a week</w:t>
+            </w:r>
+          </w:p>
+        </w:tc>
+        <w:tc>
+          <w:tcPr>
+            <w:tcW w:w="0" w:type="auto"/>
+            <w:hideMark/>
+          </w:tcPr>
+          <w:p>
+            <w:pPr>
+              <w:ind w:firstLine="426"/>
+              <w:jc w:val="right"/>
+              <w:rPr>
+                <w:i/>
+                <w:iCs/>
+                <w:color w:val="000000" w:themeColor="text1"/>
+                <w:sz w:val="20"/>
+                <w:szCs w:val="20"/>
+              </w:rPr>
+            </w:pPr>
+            <w:r>
+              <w:rPr>
+                <w:i/>
+                <w:iCs/>
+                <w:color w:val="000000" w:themeColor="text1"/>
+                <w:sz w:val="20"/>
+                <w:szCs w:val="20"/>
+              </w:rPr>
+              <w:t>98</w:t>
+            </w:r>
+          </w:p>
+        </w:tc>
+        <w:tc>
+          <w:tcPr>
+            <w:tcW w:w="0" w:type="auto"/>
+            <w:hideMark/>
+          </w:tcPr>
+          <w:p>
+            <w:pPr>
+              <w:ind w:firstLine="426"/>
+              <w:jc w:val="right"/>
+              <w:rPr>
+                <w:i/>
+                <w:iCs/>
+                <w:color w:val="000000" w:themeColor="text1"/>
+                <w:sz w:val="20"/>
+                <w:szCs w:val="20"/>
+              </w:rPr>
+            </w:pPr>
+            <w:r>
+              <w:rPr>
+                <w:i/>
+                <w:iCs/>
+                <w:color w:val="000000" w:themeColor="text1"/>
+                <w:sz w:val="20"/>
+                <w:szCs w:val="20"/>
+              </w:rPr>
+              <w:t>31.41</w:t>
+            </w:r>
+          </w:p>
+        </w:tc>
+      </w:tr>
+      <w:tr>
+        <w:trPr>
+          <w:jc w:val="center"/>
+        </w:trPr>
+        <w:tc>
+          <w:tcPr>
+            <w:tcW w:w="0" w:type="auto"/>
+            <w:hideMark/>
+          </w:tcPr>
+          <w:p>
+            <w:pPr>
+              <w:ind w:firstLine="426"/>
+              <w:jc w:val="both"/>
+              <w:rPr>
+                <w:i/>
+                <w:iCs/>
+                <w:color w:val="000000" w:themeColor="text1"/>
+                <w:sz w:val="20"/>
+                <w:szCs w:val="20"/>
+              </w:rPr>
+            </w:pPr>
+          </w:p>
+        </w:tc>
+        <w:tc>
+          <w:tcPr>
+            <w:tcW w:w="0" w:type="auto"/>
+            <w:hideMark/>
+          </w:tcPr>
+          <w:p>
+            <w:pPr>
+              <w:ind w:firstLine="426"/>
+              <w:jc w:val="right"/>
+              <w:rPr>
+                <w:i/>
+                <w:iCs/>
+                <w:color w:val="000000" w:themeColor="text1"/>
+                <w:sz w:val="20"/>
+                <w:szCs w:val="20"/>
+              </w:rPr>
+            </w:pPr>
+          </w:p>
+        </w:tc>
+        <w:tc>
+          <w:tcPr>
+            <w:tcW w:w="0" w:type="auto"/>
+            <w:hideMark/>
+          </w:tcPr>
+          <w:p>
+            <w:pPr>
+              <w:ind w:firstLine="426"/>
+              <w:jc w:val="right"/>
+              <w:rPr>
+                <w:i/>
+                <w:iCs/>
+                <w:color w:val="000000" w:themeColor="text1"/>
+                <w:sz w:val="20"/>
+                <w:szCs w:val="20"/>
+              </w:rPr>
+            </w:pPr>
+          </w:p>
+        </w:tc>
+        <w:tc>
+          <w:tcPr>
+            <w:tcW w:w="0" w:type="auto"/>
+            <w:hideMark/>
+          </w:tcPr>
+          <w:p>
+            <w:pPr>
+              <w:rPr>
+                <w:i/>
+                <w:iCs/>
+                <w:color w:val="000000" w:themeColor="text1"/>
+                <w:sz w:val="20"/>
+                <w:szCs w:val="20"/>
+              </w:rPr>
+            </w:pPr>
+            <w:r>
+              <w:rPr>
+                <w:i/>
+                <w:iCs/>
+                <w:color w:val="000000" w:themeColor="text1"/>
+                <w:sz w:val="20"/>
+                <w:szCs w:val="20"/>
+              </w:rPr>
+              <w:t>Weekly</w:t>
+            </w:r>
+          </w:p>
+        </w:tc>
+        <w:tc>
+          <w:tcPr>
+            <w:tcW w:w="0" w:type="auto"/>
+            <w:hideMark/>
+          </w:tcPr>
+          <w:p>
+            <w:pPr>
+              <w:ind w:firstLine="426"/>
+              <w:jc w:val="right"/>
+              <w:rPr>
+                <w:i/>
+                <w:iCs/>
+                <w:color w:val="000000" w:themeColor="text1"/>
+                <w:sz w:val="20"/>
+                <w:szCs w:val="20"/>
+              </w:rPr>
+            </w:pPr>
+            <w:r>
+              <w:rPr>
+                <w:i/>
+                <w:iCs/>
+                <w:color w:val="000000" w:themeColor="text1"/>
+                <w:sz w:val="20"/>
+                <w:szCs w:val="20"/>
+              </w:rPr>
+              <w:t>73</w:t>
+            </w:r>
+          </w:p>
+        </w:tc>
+        <w:tc>
+          <w:tcPr>
+            <w:tcW w:w="0" w:type="auto"/>
+            <w:hideMark/>
+          </w:tcPr>
+          <w:p>
+            <w:pPr>
+              <w:ind w:firstLine="426"/>
+              <w:jc w:val="right"/>
+              <w:rPr>
+                <w:i/>
+                <w:iCs/>
+                <w:color w:val="000000" w:themeColor="text1"/>
+                <w:sz w:val="20"/>
+                <w:szCs w:val="20"/>
+              </w:rPr>
+            </w:pPr>
+            <w:r>
+              <w:rPr>
+                <w:i/>
+                <w:iCs/>
+                <w:color w:val="000000" w:themeColor="text1"/>
+                <w:sz w:val="20"/>
+                <w:szCs w:val="20"/>
+              </w:rPr>
+              <w:t>23.38</w:t>
+            </w:r>
+          </w:p>
+        </w:tc>
+      </w:tr>
+      <w:tr>
+        <w:trPr>
+          <w:jc w:val="center"/>
+        </w:trPr>
+        <w:tc>
+          <w:tcPr>
+            <w:tcW w:w="0" w:type="auto"/>
+            <w:hideMark/>
+          </w:tcPr>
+          <w:p>
+            <w:pPr>
+              <w:jc w:val="both"/>
+              <w:rPr>
+                <w:i/>
+                <w:iCs/>
+                <w:color w:val="000000" w:themeColor="text1"/>
+                <w:sz w:val="20"/>
+                <w:szCs w:val="20"/>
+              </w:rPr>
+            </w:pPr>
+            <w:r>
+              <w:rPr>
+                <w:b/>
+                <w:bCs/>
+                <w:i/>
+                <w:iCs/>
+                <w:color w:val="000000" w:themeColor="text1"/>
+                <w:sz w:val="20"/>
+                <w:szCs w:val="20"/>
+              </w:rPr>
+              <w:t>Age (Years)</w:t>
+            </w:r>
+          </w:p>
+        </w:tc>
+        <w:tc>
+          <w:tcPr>
+            <w:tcW w:w="0" w:type="auto"/>
+            <w:hideMark/>
+          </w:tcPr>
+          <w:p>
+            <w:pPr>
+              <w:ind w:firstLine="426"/>
+              <w:jc w:val="right"/>
+              <w:rPr>
+                <w:i/>
+                <w:iCs/>
+                <w:color w:val="000000" w:themeColor="text1"/>
+                <w:sz w:val="20"/>
+                <w:szCs w:val="20"/>
+              </w:rPr>
+            </w:pPr>
+          </w:p>
+        </w:tc>
+        <w:tc>
+          <w:tcPr>
+            <w:tcW w:w="0" w:type="auto"/>
+            <w:hideMark/>
+          </w:tcPr>
+          <w:p>
+            <w:pPr>
+              <w:ind w:firstLine="426"/>
+              <w:jc w:val="right"/>
+              <w:rPr>
+                <w:i/>
+                <w:iCs/>
+                <w:color w:val="000000" w:themeColor="text1"/>
+                <w:sz w:val="20"/>
+                <w:szCs w:val="20"/>
+              </w:rPr>
+            </w:pPr>
+          </w:p>
+        </w:tc>
+        <w:tc>
+          <w:tcPr>
+            <w:tcW w:w="0" w:type="auto"/>
+            <w:hideMark/>
+          </w:tcPr>
+          <w:p>
+            <w:pPr>
+              <w:rPr>
+                <w:i/>
+                <w:iCs/>
+                <w:color w:val="000000" w:themeColor="text1"/>
+                <w:sz w:val="20"/>
+                <w:szCs w:val="20"/>
+              </w:rPr>
+            </w:pPr>
+            <w:r>
+              <w:rPr>
+                <w:i/>
+                <w:iCs/>
+                <w:color w:val="000000" w:themeColor="text1"/>
+                <w:sz w:val="20"/>
+                <w:szCs w:val="20"/>
+              </w:rPr>
+              <w:t>Monthly</w:t>
+            </w:r>
+          </w:p>
+        </w:tc>
+        <w:tc>
+          <w:tcPr>
+            <w:tcW w:w="0" w:type="auto"/>
+            <w:hideMark/>
+          </w:tcPr>
+          <w:p>
+            <w:pPr>
+              <w:ind w:firstLine="426"/>
+              <w:jc w:val="right"/>
+              <w:rPr>
+                <w:i/>
+                <w:iCs/>
+                <w:color w:val="000000" w:themeColor="text1"/>
+                <w:sz w:val="20"/>
+                <w:szCs w:val="20"/>
+              </w:rPr>
+            </w:pPr>
+            <w:r>
+              <w:rPr>
+                <w:i/>
+                <w:iCs/>
+                <w:color w:val="000000" w:themeColor="text1"/>
+                <w:sz w:val="20"/>
+                <w:szCs w:val="20"/>
+              </w:rPr>
+              <w:t>54</w:t>
+            </w:r>
+          </w:p>
+        </w:tc>
+        <w:tc>
+          <w:tcPr>
+            <w:tcW w:w="0" w:type="auto"/>
+            <w:hideMark/>
+          </w:tcPr>
+          <w:p>
+            <w:pPr>
+              <w:ind w:firstLine="426"/>
+              <w:jc w:val="right"/>
+              <w:rPr>
+                <w:i/>
+                <w:iCs/>
+                <w:color w:val="000000" w:themeColor="text1"/>
+                <w:sz w:val="20"/>
+                <w:szCs w:val="20"/>
+              </w:rPr>
+            </w:pPr>
+            <w:r>
+              <w:rPr>
+                <w:i/>
+                <w:iCs/>
+                <w:color w:val="000000" w:themeColor="text1"/>
+                <w:sz w:val="20"/>
+                <w:szCs w:val="20"/>
+              </w:rPr>
+              <w:t>17.31</w:t>
+            </w:r>
+          </w:p>
+        </w:tc>
+      </w:tr>
+      <w:tr>
+        <w:trPr>
+          <w:jc w:val="center"/>
+        </w:trPr>
+        <w:tc>
+          <w:tcPr>
+            <w:tcW w:w="0" w:type="auto"/>
+            <w:hideMark/>
+          </w:tcPr>
+          <w:p>
+            <w:pPr>
+              <w:jc w:val="both"/>
+              <w:rPr>
+                <w:i/>
+                <w:iCs/>
+                <w:color w:val="000000" w:themeColor="text1"/>
+                <w:sz w:val="20"/>
+                <w:szCs w:val="20"/>
+              </w:rPr>
+            </w:pPr>
+            <w:r>
+              <w:rPr>
+                <w:i/>
+                <w:iCs/>
+                <w:color w:val="000000" w:themeColor="text1"/>
+                <w:sz w:val="20"/>
+                <w:szCs w:val="20"/>
+              </w:rPr>
+              <w:t>18–22</w:t>
+            </w:r>
+          </w:p>
+        </w:tc>
+        <w:tc>
+          <w:tcPr>
+            <w:tcW w:w="0" w:type="auto"/>
+            <w:hideMark/>
+          </w:tcPr>
+          <w:p>
+            <w:pPr>
+              <w:ind w:firstLine="426"/>
+              <w:jc w:val="right"/>
+              <w:rPr>
+                <w:i/>
+                <w:iCs/>
+                <w:color w:val="000000" w:themeColor="text1"/>
+                <w:sz w:val="20"/>
+                <w:szCs w:val="20"/>
+              </w:rPr>
+            </w:pPr>
+            <w:r>
+              <w:rPr>
+                <w:i/>
+                <w:iCs/>
+                <w:color w:val="000000" w:themeColor="text1"/>
+                <w:sz w:val="20"/>
+                <w:szCs w:val="20"/>
+              </w:rPr>
+              <w:t>64</w:t>
+            </w:r>
+          </w:p>
+        </w:tc>
+        <w:tc>
+          <w:tcPr>
+            <w:tcW w:w="0" w:type="auto"/>
+            <w:hideMark/>
+          </w:tcPr>
+          <w:p>
+            <w:pPr>
+              <w:ind w:firstLine="426"/>
+              <w:jc w:val="right"/>
+              <w:rPr>
+                <w:i/>
+                <w:iCs/>
+                <w:color w:val="000000" w:themeColor="text1"/>
+                <w:sz w:val="20"/>
+                <w:szCs w:val="20"/>
+              </w:rPr>
+            </w:pPr>
+            <w:r>
+              <w:rPr>
+                <w:i/>
+                <w:iCs/>
+                <w:color w:val="000000" w:themeColor="text1"/>
+                <w:sz w:val="20"/>
+                <w:szCs w:val="20"/>
+              </w:rPr>
+              <w:t>20.51</w:t>
+            </w:r>
+          </w:p>
+        </w:tc>
+        <w:tc>
+          <w:tcPr>
+            <w:tcW w:w="0" w:type="auto"/>
+            <w:hideMark/>
+          </w:tcPr>
+          <w:p>
+            <w:pPr>
+              <w:rPr>
+                <w:i/>
+                <w:iCs/>
+                <w:color w:val="000000" w:themeColor="text1"/>
+                <w:sz w:val="20"/>
+                <w:szCs w:val="20"/>
+              </w:rPr>
+            </w:pPr>
+            <w:r>
+              <w:rPr>
+                <w:i/>
+                <w:iCs/>
+                <w:color w:val="000000" w:themeColor="text1"/>
+                <w:sz w:val="20"/>
+                <w:szCs w:val="20"/>
+              </w:rPr>
+              <w:t>Rarely</w:t>
+            </w:r>
+          </w:p>
+        </w:tc>
+        <w:tc>
+          <w:tcPr>
+            <w:tcW w:w="0" w:type="auto"/>
+            <w:hideMark/>
+          </w:tcPr>
+          <w:p>
+            <w:pPr>
+              <w:ind w:firstLine="426"/>
+              <w:jc w:val="right"/>
+              <w:rPr>
+                <w:i/>
+                <w:iCs/>
+                <w:color w:val="000000" w:themeColor="text1"/>
+                <w:sz w:val="20"/>
+                <w:szCs w:val="20"/>
+              </w:rPr>
+            </w:pPr>
+            <w:r>
+              <w:rPr>
+                <w:i/>
+                <w:iCs/>
+                <w:color w:val="000000" w:themeColor="text1"/>
+                <w:sz w:val="20"/>
+                <w:szCs w:val="20"/>
+              </w:rPr>
+              <w:t>35</w:t>
+            </w:r>
+          </w:p>
+        </w:tc>
+        <w:tc>
+          <w:tcPr>
+            <w:tcW w:w="0" w:type="auto"/>
+            <w:hideMark/>
+          </w:tcPr>
+          <w:p>
+            <w:pPr>
+              <w:ind w:firstLine="426"/>
+              <w:jc w:val="right"/>
+              <w:rPr>
+                <w:i/>
+                <w:iCs/>
+                <w:color w:val="000000" w:themeColor="text1"/>
+                <w:sz w:val="20"/>
+                <w:szCs w:val="20"/>
+              </w:rPr>
+            </w:pPr>
+            <w:r>
+              <w:rPr>
+                <w:i/>
+                <w:iCs/>
+                <w:color w:val="000000" w:themeColor="text1"/>
+                <w:sz w:val="20"/>
+                <w:szCs w:val="20"/>
+              </w:rPr>
+              <w:t>11.21</w:t>
+            </w:r>
+          </w:p>
+        </w:tc>
+      </w:tr>
+      <w:tr>
+        <w:trPr>
+          <w:jc w:val="center"/>
+        </w:trPr>
+        <w:tc>
+          <w:tcPr>
+            <w:tcW w:w="0" w:type="auto"/>
+            <w:hideMark/>
+          </w:tcPr>
+          <w:p>
+            <w:pPr>
+              <w:jc w:val="both"/>
+              <w:rPr>
+                <w:i/>
+                <w:iCs/>
+                <w:color w:val="000000" w:themeColor="text1"/>
+                <w:sz w:val="20"/>
+                <w:szCs w:val="20"/>
+              </w:rPr>
+            </w:pPr>
+            <w:r>
+              <w:rPr>
+                <w:i/>
+                <w:iCs/>
+                <w:color w:val="000000" w:themeColor="text1"/>
+                <w:sz w:val="20"/>
+                <w:szCs w:val="20"/>
+              </w:rPr>
+              <w:t>23–28</w:t>
+            </w:r>
+          </w:p>
+        </w:tc>
+        <w:tc>
+          <w:tcPr>
+            <w:tcW w:w="0" w:type="auto"/>
+            <w:hideMark/>
+          </w:tcPr>
+          <w:p>
+            <w:pPr>
+              <w:ind w:firstLine="426"/>
+              <w:jc w:val="right"/>
+              <w:rPr>
+                <w:i/>
+                <w:iCs/>
+                <w:color w:val="000000" w:themeColor="text1"/>
+                <w:sz w:val="20"/>
+                <w:szCs w:val="20"/>
+              </w:rPr>
+            </w:pPr>
+            <w:r>
+              <w:rPr>
+                <w:i/>
+                <w:iCs/>
+                <w:color w:val="000000" w:themeColor="text1"/>
+                <w:sz w:val="20"/>
+                <w:szCs w:val="20"/>
+              </w:rPr>
+              <w:t>75</w:t>
+            </w:r>
+          </w:p>
+        </w:tc>
+        <w:tc>
+          <w:tcPr>
+            <w:tcW w:w="0" w:type="auto"/>
+            <w:hideMark/>
+          </w:tcPr>
+          <w:p>
+            <w:pPr>
+              <w:ind w:firstLine="426"/>
+              <w:jc w:val="right"/>
+              <w:rPr>
+                <w:i/>
+                <w:iCs/>
+                <w:color w:val="000000" w:themeColor="text1"/>
+                <w:sz w:val="20"/>
+                <w:szCs w:val="20"/>
+              </w:rPr>
+            </w:pPr>
+            <w:r>
+              <w:rPr>
+                <w:i/>
+                <w:iCs/>
+                <w:color w:val="000000" w:themeColor="text1"/>
+                <w:sz w:val="20"/>
+                <w:szCs w:val="20"/>
+              </w:rPr>
+              <w:t>24.04</w:t>
+            </w:r>
+          </w:p>
+        </w:tc>
+        <w:tc>
+          <w:tcPr>
+            <w:tcW w:w="0" w:type="auto"/>
+            <w:hideMark/>
+          </w:tcPr>
+          <w:p>
+            <w:pPr>
+              <w:ind w:firstLine="426"/>
+              <w:rPr>
+                <w:i/>
+                <w:iCs/>
+                <w:color w:val="000000" w:themeColor="text1"/>
+                <w:sz w:val="20"/>
+                <w:szCs w:val="20"/>
+              </w:rPr>
+            </w:pPr>
+          </w:p>
+        </w:tc>
+        <w:tc>
+          <w:tcPr>
+            <w:tcW w:w="0" w:type="auto"/>
+            <w:hideMark/>
+          </w:tcPr>
+          <w:p>
+            <w:pPr>
+              <w:ind w:firstLine="426"/>
+              <w:jc w:val="right"/>
+              <w:rPr>
+                <w:i/>
+                <w:iCs/>
+                <w:color w:val="000000" w:themeColor="text1"/>
+                <w:sz w:val="20"/>
+                <w:szCs w:val="20"/>
+              </w:rPr>
+            </w:pPr>
+          </w:p>
+        </w:tc>
+        <w:tc>
+          <w:tcPr>
+            <w:tcW w:w="0" w:type="auto"/>
+            <w:hideMark/>
+          </w:tcPr>
+          <w:p>
+            <w:pPr>
+              <w:ind w:firstLine="426"/>
+              <w:jc w:val="right"/>
+              <w:rPr>
+                <w:i/>
+                <w:iCs/>
+                <w:color w:val="000000" w:themeColor="text1"/>
+                <w:sz w:val="20"/>
+                <w:szCs w:val="20"/>
+              </w:rPr>
+            </w:pPr>
+          </w:p>
+        </w:tc>
+      </w:tr>
+      <w:tr>
+        <w:trPr>
+          <w:jc w:val="center"/>
+        </w:trPr>
+        <w:tc>
+          <w:tcPr>
+            <w:tcW w:w="0" w:type="auto"/>
+            <w:hideMark/>
+          </w:tcPr>
+          <w:p>
+            <w:pPr>
+              <w:jc w:val="both"/>
+              <w:rPr>
+                <w:i/>
+                <w:iCs/>
+                <w:color w:val="000000" w:themeColor="text1"/>
+                <w:sz w:val="20"/>
+                <w:szCs w:val="20"/>
+              </w:rPr>
+            </w:pPr>
+            <w:r>
+              <w:rPr>
+                <w:i/>
+                <w:iCs/>
+                <w:color w:val="000000" w:themeColor="text1"/>
+                <w:sz w:val="20"/>
+                <w:szCs w:val="20"/>
+              </w:rPr>
+              <w:t>29–34</w:t>
+            </w:r>
+          </w:p>
+        </w:tc>
+        <w:tc>
+          <w:tcPr>
+            <w:tcW w:w="0" w:type="auto"/>
+            <w:hideMark/>
+          </w:tcPr>
+          <w:p>
+            <w:pPr>
+              <w:ind w:firstLine="426"/>
+              <w:jc w:val="right"/>
+              <w:rPr>
+                <w:i/>
+                <w:iCs/>
+                <w:color w:val="000000" w:themeColor="text1"/>
+                <w:sz w:val="20"/>
+                <w:szCs w:val="20"/>
+              </w:rPr>
+            </w:pPr>
+            <w:r>
+              <w:rPr>
+                <w:i/>
+                <w:iCs/>
+                <w:color w:val="000000" w:themeColor="text1"/>
+                <w:sz w:val="20"/>
+                <w:szCs w:val="20"/>
+              </w:rPr>
+              <w:t>60</w:t>
+            </w:r>
+          </w:p>
+        </w:tc>
+        <w:tc>
+          <w:tcPr>
+            <w:tcW w:w="0" w:type="auto"/>
+            <w:hideMark/>
+          </w:tcPr>
+          <w:p>
+            <w:pPr>
+              <w:ind w:firstLine="426"/>
+              <w:jc w:val="right"/>
+              <w:rPr>
+                <w:i/>
+                <w:iCs/>
+                <w:color w:val="000000" w:themeColor="text1"/>
+                <w:sz w:val="20"/>
+                <w:szCs w:val="20"/>
+              </w:rPr>
+            </w:pPr>
+            <w:r>
+              <w:rPr>
+                <w:i/>
+                <w:iCs/>
+                <w:color w:val="000000" w:themeColor="text1"/>
+                <w:sz w:val="20"/>
+                <w:szCs w:val="20"/>
+              </w:rPr>
+              <w:t>19.23</w:t>
+            </w:r>
+          </w:p>
+        </w:tc>
+        <w:tc>
+          <w:tcPr>
+            <w:tcW w:w="0" w:type="auto"/>
+            <w:hideMark/>
+          </w:tcPr>
+          <w:p>
+            <w:pPr>
+              <w:rPr>
+                <w:i/>
+                <w:iCs/>
+                <w:color w:val="000000" w:themeColor="text1"/>
+                <w:sz w:val="20"/>
+                <w:szCs w:val="20"/>
+              </w:rPr>
+            </w:pPr>
+            <w:r>
+              <w:rPr>
+                <w:b/>
+                <w:bCs/>
+                <w:i/>
+                <w:iCs/>
+                <w:color w:val="000000" w:themeColor="text1"/>
+                <w:sz w:val="20"/>
+                <w:szCs w:val="20"/>
+              </w:rPr>
+              <w:t>NFT Interaction</w:t>
+            </w:r>
+          </w:p>
+        </w:tc>
+        <w:tc>
+          <w:tcPr>
+            <w:tcW w:w="0" w:type="auto"/>
+            <w:hideMark/>
+          </w:tcPr>
+          <w:p>
+            <w:pPr>
+              <w:ind w:firstLine="426"/>
+              <w:jc w:val="right"/>
+              <w:rPr>
+                <w:i/>
+                <w:iCs/>
+                <w:color w:val="000000" w:themeColor="text1"/>
+                <w:sz w:val="20"/>
+                <w:szCs w:val="20"/>
+              </w:rPr>
+            </w:pPr>
+          </w:p>
+        </w:tc>
+        <w:tc>
+          <w:tcPr>
+            <w:tcW w:w="0" w:type="auto"/>
+            <w:hideMark/>
+          </w:tcPr>
+          <w:p>
+            <w:pPr>
+              <w:ind w:firstLine="426"/>
+              <w:jc w:val="right"/>
+              <w:rPr>
+                <w:i/>
+                <w:iCs/>
+                <w:color w:val="000000" w:themeColor="text1"/>
+                <w:sz w:val="20"/>
+                <w:szCs w:val="20"/>
+              </w:rPr>
+            </w:pPr>
+          </w:p>
+        </w:tc>
+      </w:tr>
+      <w:tr>
+        <w:trPr>
+          <w:jc w:val="center"/>
+        </w:trPr>
+        <w:tc>
+          <w:tcPr>
+            <w:tcW w:w="0" w:type="auto"/>
+            <w:hideMark/>
+          </w:tcPr>
+          <w:p>
+            <w:pPr>
+              <w:jc w:val="both"/>
+              <w:rPr>
+                <w:i/>
+                <w:iCs/>
+                <w:color w:val="000000" w:themeColor="text1"/>
+                <w:sz w:val="20"/>
+                <w:szCs w:val="20"/>
+              </w:rPr>
+            </w:pPr>
+            <w:r>
+              <w:rPr>
+                <w:i/>
+                <w:iCs/>
+                <w:color w:val="000000" w:themeColor="text1"/>
+                <w:sz w:val="20"/>
+                <w:szCs w:val="20"/>
+              </w:rPr>
+              <w:t>35–41</w:t>
+            </w:r>
+          </w:p>
+        </w:tc>
+        <w:tc>
+          <w:tcPr>
+            <w:tcW w:w="0" w:type="auto"/>
+            <w:hideMark/>
+          </w:tcPr>
+          <w:p>
+            <w:pPr>
+              <w:ind w:firstLine="426"/>
+              <w:jc w:val="right"/>
+              <w:rPr>
+                <w:i/>
+                <w:iCs/>
+                <w:color w:val="000000" w:themeColor="text1"/>
+                <w:sz w:val="20"/>
+                <w:szCs w:val="20"/>
+              </w:rPr>
+            </w:pPr>
+            <w:r>
+              <w:rPr>
+                <w:i/>
+                <w:iCs/>
+                <w:color w:val="000000" w:themeColor="text1"/>
+                <w:sz w:val="20"/>
+                <w:szCs w:val="20"/>
+              </w:rPr>
+              <w:t>57</w:t>
+            </w:r>
+          </w:p>
+        </w:tc>
+        <w:tc>
+          <w:tcPr>
+            <w:tcW w:w="0" w:type="auto"/>
+            <w:hideMark/>
+          </w:tcPr>
+          <w:p>
+            <w:pPr>
+              <w:ind w:firstLine="426"/>
+              <w:jc w:val="right"/>
+              <w:rPr>
+                <w:i/>
+                <w:iCs/>
+                <w:color w:val="000000" w:themeColor="text1"/>
+                <w:sz w:val="20"/>
+                <w:szCs w:val="20"/>
+              </w:rPr>
+            </w:pPr>
+            <w:r>
+              <w:rPr>
+                <w:i/>
+                <w:iCs/>
+                <w:color w:val="000000" w:themeColor="text1"/>
+                <w:sz w:val="20"/>
+                <w:szCs w:val="20"/>
+              </w:rPr>
+              <w:t>18.27</w:t>
+            </w:r>
+          </w:p>
+        </w:tc>
+        <w:tc>
+          <w:tcPr>
+            <w:tcW w:w="0" w:type="auto"/>
+            <w:hideMark/>
+          </w:tcPr>
+          <w:p>
+            <w:pPr>
+              <w:rPr>
+                <w:i/>
+                <w:iCs/>
+                <w:color w:val="000000" w:themeColor="text1"/>
+                <w:sz w:val="20"/>
+                <w:szCs w:val="20"/>
+              </w:rPr>
+            </w:pPr>
+            <w:r>
+              <w:rPr>
+                <w:i/>
+                <w:iCs/>
+                <w:color w:val="000000" w:themeColor="text1"/>
+                <w:sz w:val="20"/>
+                <w:szCs w:val="20"/>
+              </w:rPr>
+              <w:t>Yes</w:t>
+            </w:r>
+          </w:p>
+        </w:tc>
+        <w:tc>
+          <w:tcPr>
+            <w:tcW w:w="0" w:type="auto"/>
+            <w:hideMark/>
+          </w:tcPr>
+          <w:p>
+            <w:pPr>
+              <w:ind w:firstLine="426"/>
+              <w:jc w:val="right"/>
+              <w:rPr>
+                <w:i/>
+                <w:iCs/>
+                <w:color w:val="000000" w:themeColor="text1"/>
+                <w:sz w:val="20"/>
+                <w:szCs w:val="20"/>
+              </w:rPr>
+            </w:pPr>
+            <w:r>
+              <w:rPr>
+                <w:i/>
+                <w:iCs/>
+                <w:color w:val="000000" w:themeColor="text1"/>
+                <w:sz w:val="20"/>
+                <w:szCs w:val="20"/>
+              </w:rPr>
+              <w:t>141</w:t>
+            </w:r>
+          </w:p>
+        </w:tc>
+        <w:tc>
+          <w:tcPr>
+            <w:tcW w:w="0" w:type="auto"/>
+            <w:hideMark/>
+          </w:tcPr>
+          <w:p>
+            <w:pPr>
+              <w:ind w:firstLine="426"/>
+              <w:jc w:val="right"/>
+              <w:rPr>
+                <w:i/>
+                <w:iCs/>
+                <w:color w:val="000000" w:themeColor="text1"/>
+                <w:sz w:val="20"/>
+                <w:szCs w:val="20"/>
+              </w:rPr>
+            </w:pPr>
+            <w:r>
+              <w:rPr>
+                <w:i/>
+                <w:iCs/>
+                <w:color w:val="000000" w:themeColor="text1"/>
+                <w:sz w:val="20"/>
+                <w:szCs w:val="20"/>
+              </w:rPr>
+              <w:t>45.19</w:t>
+            </w:r>
+          </w:p>
+        </w:tc>
+      </w:tr>
+      <w:tr>
+        <w:trPr>
+          <w:jc w:val="center"/>
+        </w:trPr>
+        <w:tc>
+          <w:tcPr>
+            <w:tcW w:w="0" w:type="auto"/>
+            <w:hideMark/>
+          </w:tcPr>
+          <w:p>
+            <w:pPr>
+              <w:jc w:val="both"/>
+              <w:rPr>
+                <w:i/>
+                <w:iCs/>
+                <w:color w:val="000000" w:themeColor="text1"/>
+                <w:sz w:val="20"/>
+                <w:szCs w:val="20"/>
+              </w:rPr>
+            </w:pPr>
+            <w:r>
+              <w:rPr>
+                <w:i/>
+                <w:iCs/>
+                <w:color w:val="000000" w:themeColor="text1"/>
+                <w:sz w:val="20"/>
+                <w:szCs w:val="20"/>
+              </w:rPr>
+              <w:t>42–45</w:t>
+            </w:r>
+          </w:p>
+        </w:tc>
+        <w:tc>
+          <w:tcPr>
+            <w:tcW w:w="0" w:type="auto"/>
+            <w:hideMark/>
+          </w:tcPr>
+          <w:p>
+            <w:pPr>
+              <w:ind w:firstLine="426"/>
+              <w:jc w:val="right"/>
+              <w:rPr>
+                <w:i/>
+                <w:iCs/>
+                <w:color w:val="000000" w:themeColor="text1"/>
+                <w:sz w:val="20"/>
+                <w:szCs w:val="20"/>
+              </w:rPr>
+            </w:pPr>
+            <w:r>
+              <w:rPr>
+                <w:i/>
+                <w:iCs/>
+                <w:color w:val="000000" w:themeColor="text1"/>
+                <w:sz w:val="20"/>
+                <w:szCs w:val="20"/>
+              </w:rPr>
+              <w:t>56</w:t>
+            </w:r>
+          </w:p>
+        </w:tc>
+        <w:tc>
+          <w:tcPr>
+            <w:tcW w:w="0" w:type="auto"/>
+            <w:hideMark/>
+          </w:tcPr>
+          <w:p>
+            <w:pPr>
+              <w:ind w:firstLine="426"/>
+              <w:jc w:val="right"/>
+              <w:rPr>
+                <w:i/>
+                <w:iCs/>
+                <w:color w:val="000000" w:themeColor="text1"/>
+                <w:sz w:val="20"/>
+                <w:szCs w:val="20"/>
+              </w:rPr>
+            </w:pPr>
+            <w:r>
+              <w:rPr>
+                <w:i/>
+                <w:iCs/>
+                <w:color w:val="000000" w:themeColor="text1"/>
+                <w:sz w:val="20"/>
+                <w:szCs w:val="20"/>
+              </w:rPr>
+              <w:t>17.95</w:t>
+            </w:r>
+          </w:p>
+        </w:tc>
+        <w:tc>
+          <w:tcPr>
+            <w:tcW w:w="0" w:type="auto"/>
+            <w:hideMark/>
+          </w:tcPr>
+          <w:p>
+            <w:pPr>
+              <w:rPr>
+                <w:i/>
+                <w:iCs/>
+                <w:color w:val="000000" w:themeColor="text1"/>
+                <w:sz w:val="20"/>
+                <w:szCs w:val="20"/>
+              </w:rPr>
+            </w:pPr>
+            <w:r>
+              <w:rPr>
+                <w:i/>
+                <w:iCs/>
+                <w:color w:val="000000" w:themeColor="text1"/>
+                <w:sz w:val="20"/>
+                <w:szCs w:val="20"/>
+              </w:rPr>
+              <w:t>No</w:t>
+            </w:r>
+          </w:p>
+        </w:tc>
+        <w:tc>
+          <w:tcPr>
+            <w:tcW w:w="0" w:type="auto"/>
+            <w:hideMark/>
+          </w:tcPr>
+          <w:p>
+            <w:pPr>
+              <w:ind w:firstLine="426"/>
+              <w:jc w:val="right"/>
+              <w:rPr>
+                <w:i/>
+                <w:iCs/>
+                <w:color w:val="000000" w:themeColor="text1"/>
+                <w:sz w:val="20"/>
+                <w:szCs w:val="20"/>
+              </w:rPr>
+            </w:pPr>
+            <w:r>
+              <w:rPr>
+                <w:i/>
+                <w:iCs/>
+                <w:color w:val="000000" w:themeColor="text1"/>
+                <w:sz w:val="20"/>
+                <w:szCs w:val="20"/>
+              </w:rPr>
+              <w:t>171</w:t>
+            </w:r>
+          </w:p>
+        </w:tc>
+        <w:tc>
+          <w:tcPr>
+            <w:tcW w:w="0" w:type="auto"/>
+            <w:hideMark/>
+          </w:tcPr>
+          <w:p>
+            <w:pPr>
+              <w:ind w:firstLine="426"/>
+              <w:jc w:val="right"/>
+              <w:rPr>
+                <w:i/>
+                <w:iCs/>
+                <w:color w:val="000000" w:themeColor="text1"/>
+                <w:sz w:val="20"/>
+                <w:szCs w:val="20"/>
+              </w:rPr>
+            </w:pPr>
+            <w:r>
+              <w:rPr>
+                <w:i/>
+                <w:iCs/>
+                <w:color w:val="000000" w:themeColor="text1"/>
+                <w:sz w:val="20"/>
+                <w:szCs w:val="20"/>
+              </w:rPr>
+              <w:t>54.81</w:t>
+            </w:r>
+          </w:p>
+        </w:tc>
+      </w:tr>
+      <w:tr>
+        <w:trPr>
+          <w:jc w:val="center"/>
+        </w:trPr>
+        <w:tc>
+          <w:tcPr>
+            <w:tcW w:w="0" w:type="auto"/>
+            <w:hideMark/>
+          </w:tcPr>
+          <w:p>
+            <w:pPr>
+              <w:jc w:val="both"/>
+              <w:rPr>
+                <w:i/>
+                <w:iCs/>
+                <w:color w:val="000000" w:themeColor="text1"/>
+                <w:sz w:val="20"/>
+                <w:szCs w:val="20"/>
+              </w:rPr>
+            </w:pPr>
+            <w:r>
+              <w:rPr>
+                <w:b/>
+                <w:bCs/>
+                <w:i/>
+                <w:iCs/>
+                <w:color w:val="000000" w:themeColor="text1"/>
+                <w:sz w:val="20"/>
+                <w:szCs w:val="20"/>
+              </w:rPr>
+              <w:t>Marital Status</w:t>
+            </w:r>
+          </w:p>
+        </w:tc>
+        <w:tc>
+          <w:tcPr>
+            <w:tcW w:w="0" w:type="auto"/>
+            <w:hideMark/>
+          </w:tcPr>
+          <w:p>
+            <w:pPr>
+              <w:ind w:firstLine="426"/>
+              <w:jc w:val="right"/>
+              <w:rPr>
+                <w:i/>
+                <w:iCs/>
+                <w:color w:val="000000" w:themeColor="text1"/>
+                <w:sz w:val="20"/>
+                <w:szCs w:val="20"/>
+              </w:rPr>
+            </w:pPr>
+          </w:p>
+        </w:tc>
+        <w:tc>
+          <w:tcPr>
+            <w:tcW w:w="0" w:type="auto"/>
+            <w:hideMark/>
+          </w:tcPr>
+          <w:p>
+            <w:pPr>
+              <w:ind w:firstLine="426"/>
+              <w:jc w:val="right"/>
+              <w:rPr>
+                <w:i/>
+                <w:iCs/>
+                <w:color w:val="000000" w:themeColor="text1"/>
+                <w:sz w:val="20"/>
+                <w:szCs w:val="20"/>
+              </w:rPr>
+            </w:pPr>
+          </w:p>
+        </w:tc>
+        <w:tc>
+          <w:tcPr>
+            <w:tcW w:w="0" w:type="auto"/>
+            <w:hideMark/>
+          </w:tcPr>
+          <w:p>
+            <w:pPr>
+              <w:rPr>
+                <w:i/>
+                <w:iCs/>
+                <w:color w:val="000000" w:themeColor="text1"/>
+                <w:sz w:val="20"/>
+                <w:szCs w:val="20"/>
+              </w:rPr>
+            </w:pPr>
+            <w:r>
+              <w:rPr>
+                <w:b/>
+                <w:bCs/>
+                <w:i/>
+                <w:iCs/>
+                <w:color w:val="000000" w:themeColor="text1"/>
+                <w:sz w:val="20"/>
+                <w:szCs w:val="20"/>
+              </w:rPr>
+              <w:t>Virtual Event Participation</w:t>
+            </w:r>
+          </w:p>
+        </w:tc>
+        <w:tc>
+          <w:tcPr>
+            <w:tcW w:w="0" w:type="auto"/>
+            <w:hideMark/>
+          </w:tcPr>
+          <w:p>
+            <w:pPr>
+              <w:ind w:firstLine="426"/>
+              <w:jc w:val="right"/>
+              <w:rPr>
+                <w:i/>
+                <w:iCs/>
+                <w:color w:val="000000" w:themeColor="text1"/>
+                <w:sz w:val="20"/>
+                <w:szCs w:val="20"/>
+              </w:rPr>
+            </w:pPr>
+          </w:p>
+        </w:tc>
+        <w:tc>
+          <w:tcPr>
+            <w:tcW w:w="0" w:type="auto"/>
+            <w:hideMark/>
+          </w:tcPr>
+          <w:p>
+            <w:pPr>
+              <w:ind w:firstLine="426"/>
+              <w:jc w:val="right"/>
+              <w:rPr>
+                <w:i/>
+                <w:iCs/>
+                <w:color w:val="000000" w:themeColor="text1"/>
+                <w:sz w:val="20"/>
+                <w:szCs w:val="20"/>
+              </w:rPr>
+            </w:pPr>
+          </w:p>
+        </w:tc>
+      </w:tr>
+      <w:tr>
+        <w:trPr>
+          <w:jc w:val="center"/>
+        </w:trPr>
+        <w:tc>
+          <w:tcPr>
+            <w:tcW w:w="0" w:type="auto"/>
+            <w:hideMark/>
+          </w:tcPr>
+          <w:p>
+            <w:pPr>
+              <w:jc w:val="both"/>
+              <w:rPr>
+                <w:i/>
+                <w:iCs/>
+                <w:color w:val="000000" w:themeColor="text1"/>
+                <w:sz w:val="20"/>
+                <w:szCs w:val="20"/>
+              </w:rPr>
+            </w:pPr>
+            <w:r>
+              <w:rPr>
+                <w:i/>
+                <w:iCs/>
+                <w:color w:val="000000" w:themeColor="text1"/>
+                <w:sz w:val="20"/>
+                <w:szCs w:val="20"/>
+              </w:rPr>
+              <w:t>Single</w:t>
+            </w:r>
+          </w:p>
+        </w:tc>
+        <w:tc>
+          <w:tcPr>
+            <w:tcW w:w="0" w:type="auto"/>
+            <w:hideMark/>
+          </w:tcPr>
+          <w:p>
+            <w:pPr>
+              <w:ind w:firstLine="426"/>
+              <w:jc w:val="right"/>
+              <w:rPr>
+                <w:i/>
+                <w:iCs/>
+                <w:color w:val="000000" w:themeColor="text1"/>
+                <w:sz w:val="20"/>
+                <w:szCs w:val="20"/>
+              </w:rPr>
+            </w:pPr>
+            <w:r>
+              <w:rPr>
+                <w:i/>
+                <w:iCs/>
+                <w:color w:val="000000" w:themeColor="text1"/>
+                <w:sz w:val="20"/>
+                <w:szCs w:val="20"/>
+              </w:rPr>
+              <w:t>107</w:t>
+            </w:r>
+          </w:p>
+        </w:tc>
+        <w:tc>
+          <w:tcPr>
+            <w:tcW w:w="0" w:type="auto"/>
+            <w:hideMark/>
+          </w:tcPr>
+          <w:p>
+            <w:pPr>
+              <w:ind w:firstLine="426"/>
+              <w:jc w:val="right"/>
+              <w:rPr>
+                <w:i/>
+                <w:iCs/>
+                <w:color w:val="000000" w:themeColor="text1"/>
+                <w:sz w:val="20"/>
+                <w:szCs w:val="20"/>
+              </w:rPr>
+            </w:pPr>
+            <w:r>
+              <w:rPr>
+                <w:i/>
+                <w:iCs/>
+                <w:color w:val="000000" w:themeColor="text1"/>
+                <w:sz w:val="20"/>
+                <w:szCs w:val="20"/>
+              </w:rPr>
+              <w:t>34.29</w:t>
+            </w:r>
+          </w:p>
+        </w:tc>
+        <w:tc>
+          <w:tcPr>
+            <w:tcW w:w="0" w:type="auto"/>
+            <w:hideMark/>
+          </w:tcPr>
+          <w:p>
+            <w:pPr>
+              <w:rPr>
+                <w:i/>
+                <w:iCs/>
+                <w:color w:val="000000" w:themeColor="text1"/>
+                <w:sz w:val="20"/>
+                <w:szCs w:val="20"/>
+              </w:rPr>
+            </w:pPr>
+            <w:r>
+              <w:rPr>
+                <w:i/>
+                <w:iCs/>
+                <w:color w:val="000000" w:themeColor="text1"/>
+                <w:sz w:val="20"/>
+                <w:szCs w:val="20"/>
+              </w:rPr>
+              <w:t>Yes</w:t>
+            </w:r>
+          </w:p>
+        </w:tc>
+        <w:tc>
+          <w:tcPr>
+            <w:tcW w:w="0" w:type="auto"/>
+            <w:hideMark/>
+          </w:tcPr>
+          <w:p>
+            <w:pPr>
+              <w:ind w:firstLine="426"/>
+              <w:jc w:val="right"/>
+              <w:rPr>
+                <w:i/>
+                <w:iCs/>
+                <w:color w:val="000000" w:themeColor="text1"/>
+                <w:sz w:val="20"/>
+                <w:szCs w:val="20"/>
+              </w:rPr>
+            </w:pPr>
+            <w:r>
+              <w:rPr>
+                <w:i/>
+                <w:iCs/>
+                <w:color w:val="000000" w:themeColor="text1"/>
+                <w:sz w:val="20"/>
+                <w:szCs w:val="20"/>
+              </w:rPr>
+              <w:t>129</w:t>
+            </w:r>
+          </w:p>
+        </w:tc>
+        <w:tc>
+          <w:tcPr>
+            <w:tcW w:w="0" w:type="auto"/>
+            <w:hideMark/>
+          </w:tcPr>
+          <w:p>
+            <w:pPr>
+              <w:ind w:firstLine="426"/>
+              <w:jc w:val="right"/>
+              <w:rPr>
+                <w:i/>
+                <w:iCs/>
+                <w:color w:val="000000" w:themeColor="text1"/>
+                <w:sz w:val="20"/>
+                <w:szCs w:val="20"/>
+              </w:rPr>
+            </w:pPr>
+            <w:r>
+              <w:rPr>
+                <w:i/>
+                <w:iCs/>
+                <w:color w:val="000000" w:themeColor="text1"/>
+                <w:sz w:val="20"/>
+                <w:szCs w:val="20"/>
+              </w:rPr>
+              <w:t>41.35</w:t>
+            </w:r>
+          </w:p>
+        </w:tc>
+      </w:tr>
+      <w:tr>
+        <w:trPr>
+          <w:jc w:val="center"/>
+        </w:trPr>
+        <w:tc>
+          <w:tcPr>
+            <w:tcW w:w="0" w:type="auto"/>
+            <w:hideMark/>
+          </w:tcPr>
+          <w:p>
+            <w:pPr>
+              <w:rPr>
+                <w:i/>
+                <w:iCs/>
+                <w:color w:val="000000" w:themeColor="text1"/>
+                <w:sz w:val="20"/>
+                <w:szCs w:val="20"/>
+              </w:rPr>
+            </w:pPr>
+            <w:r>
+              <w:rPr>
+                <w:i/>
+                <w:iCs/>
+                <w:color w:val="000000" w:themeColor="text1"/>
+                <w:sz w:val="20"/>
+                <w:szCs w:val="20"/>
+              </w:rPr>
+              <w:t>Married with</w:t>
+            </w:r>
+            <w:r>
+              <w:rPr>
+                <w:i/>
+                <w:iCs/>
+                <w:color w:val="000000" w:themeColor="text1"/>
+                <w:sz w:val="20"/>
+                <w:szCs w:val="20"/>
+              </w:rPr>
+              <w:t xml:space="preserve"> </w:t>
+            </w:r>
+            <w:r>
+              <w:rPr>
+                <w:i/>
+                <w:iCs/>
+                <w:color w:val="000000" w:themeColor="text1"/>
+                <w:sz w:val="20"/>
+                <w:szCs w:val="20"/>
+              </w:rPr>
+              <w:t>children</w:t>
+            </w:r>
+          </w:p>
+        </w:tc>
+        <w:tc>
+          <w:tcPr>
+            <w:tcW w:w="0" w:type="auto"/>
+            <w:hideMark/>
+          </w:tcPr>
+          <w:p>
+            <w:pPr>
+              <w:ind w:firstLine="426"/>
+              <w:jc w:val="right"/>
+              <w:rPr>
+                <w:i/>
+                <w:iCs/>
+                <w:color w:val="000000" w:themeColor="text1"/>
+                <w:sz w:val="20"/>
+                <w:szCs w:val="20"/>
+              </w:rPr>
+            </w:pPr>
+            <w:r>
+              <w:rPr>
+                <w:i/>
+                <w:iCs/>
+                <w:color w:val="000000" w:themeColor="text1"/>
+                <w:sz w:val="20"/>
+                <w:szCs w:val="20"/>
+              </w:rPr>
+              <w:t>84</w:t>
+            </w:r>
+          </w:p>
+        </w:tc>
+        <w:tc>
+          <w:tcPr>
+            <w:tcW w:w="0" w:type="auto"/>
+            <w:hideMark/>
+          </w:tcPr>
+          <w:p>
+            <w:pPr>
+              <w:ind w:firstLine="426"/>
+              <w:jc w:val="right"/>
+              <w:rPr>
+                <w:i/>
+                <w:iCs/>
+                <w:color w:val="000000" w:themeColor="text1"/>
+                <w:sz w:val="20"/>
+                <w:szCs w:val="20"/>
+              </w:rPr>
+            </w:pPr>
+            <w:r>
+              <w:rPr>
+                <w:i/>
+                <w:iCs/>
+                <w:color w:val="000000" w:themeColor="text1"/>
+                <w:sz w:val="20"/>
+                <w:szCs w:val="20"/>
+              </w:rPr>
+              <w:t>26.93</w:t>
+            </w:r>
+          </w:p>
+        </w:tc>
+        <w:tc>
+          <w:tcPr>
+            <w:tcW w:w="0" w:type="auto"/>
+            <w:hideMark/>
+          </w:tcPr>
+          <w:p>
+            <w:pPr>
+              <w:rPr>
+                <w:i/>
+                <w:iCs/>
+                <w:color w:val="000000" w:themeColor="text1"/>
+                <w:sz w:val="20"/>
+                <w:szCs w:val="20"/>
+              </w:rPr>
+            </w:pPr>
+            <w:r>
+              <w:rPr>
+                <w:i/>
+                <w:iCs/>
+                <w:color w:val="000000" w:themeColor="text1"/>
+                <w:sz w:val="20"/>
+                <w:szCs w:val="20"/>
+              </w:rPr>
+              <w:t>No</w:t>
+            </w:r>
+          </w:p>
+        </w:tc>
+        <w:tc>
+          <w:tcPr>
+            <w:tcW w:w="0" w:type="auto"/>
+            <w:hideMark/>
+          </w:tcPr>
+          <w:p>
+            <w:pPr>
+              <w:ind w:firstLine="426"/>
+              <w:jc w:val="right"/>
+              <w:rPr>
+                <w:i/>
+                <w:iCs/>
+                <w:color w:val="000000" w:themeColor="text1"/>
+                <w:sz w:val="20"/>
+                <w:szCs w:val="20"/>
+              </w:rPr>
+            </w:pPr>
+            <w:r>
+              <w:rPr>
+                <w:i/>
+                <w:iCs/>
+                <w:color w:val="000000" w:themeColor="text1"/>
+                <w:sz w:val="20"/>
+                <w:szCs w:val="20"/>
+              </w:rPr>
+              <w:t>183</w:t>
+            </w:r>
+          </w:p>
+        </w:tc>
+        <w:tc>
+          <w:tcPr>
+            <w:tcW w:w="0" w:type="auto"/>
+            <w:hideMark/>
+          </w:tcPr>
+          <w:p>
+            <w:pPr>
+              <w:ind w:firstLine="426"/>
+              <w:jc w:val="right"/>
+              <w:rPr>
+                <w:i/>
+                <w:iCs/>
+                <w:color w:val="000000" w:themeColor="text1"/>
+                <w:sz w:val="20"/>
+                <w:szCs w:val="20"/>
+              </w:rPr>
+            </w:pPr>
+            <w:r>
+              <w:rPr>
+                <w:i/>
+                <w:iCs/>
+                <w:color w:val="000000" w:themeColor="text1"/>
+                <w:sz w:val="20"/>
+                <w:szCs w:val="20"/>
+              </w:rPr>
+              <w:t>58.65</w:t>
+            </w:r>
+          </w:p>
+        </w:tc>
+      </w:tr>
+      <w:tr>
+        <w:trPr>
+          <w:jc w:val="center"/>
+        </w:trPr>
+        <w:tc>
+          <w:tcPr>
+            <w:tcW w:w="0" w:type="auto"/>
+            <w:hideMark/>
+          </w:tcPr>
+          <w:p>
+            <w:pPr>
+              <w:rPr>
+                <w:i/>
+                <w:iCs/>
+                <w:color w:val="000000" w:themeColor="text1"/>
+                <w:sz w:val="20"/>
+                <w:szCs w:val="20"/>
+              </w:rPr>
+            </w:pPr>
+            <w:r>
+              <w:rPr>
+                <w:i/>
+                <w:iCs/>
+                <w:color w:val="000000" w:themeColor="text1"/>
+                <w:sz w:val="20"/>
+                <w:szCs w:val="20"/>
+              </w:rPr>
+              <w:t>Married without children</w:t>
+            </w:r>
+          </w:p>
+        </w:tc>
+        <w:tc>
+          <w:tcPr>
+            <w:tcW w:w="0" w:type="auto"/>
+            <w:hideMark/>
+          </w:tcPr>
+          <w:p>
+            <w:pPr>
+              <w:ind w:firstLine="426"/>
+              <w:jc w:val="right"/>
+              <w:rPr>
+                <w:i/>
+                <w:iCs/>
+                <w:color w:val="000000" w:themeColor="text1"/>
+                <w:sz w:val="20"/>
+                <w:szCs w:val="20"/>
+              </w:rPr>
+            </w:pPr>
+            <w:r>
+              <w:rPr>
+                <w:i/>
+                <w:iCs/>
+                <w:color w:val="000000" w:themeColor="text1"/>
+                <w:sz w:val="20"/>
+                <w:szCs w:val="20"/>
+              </w:rPr>
+              <w:t>121</w:t>
+            </w:r>
+          </w:p>
+        </w:tc>
+        <w:tc>
+          <w:tcPr>
+            <w:tcW w:w="0" w:type="auto"/>
+            <w:hideMark/>
+          </w:tcPr>
+          <w:p>
+            <w:pPr>
+              <w:ind w:firstLine="426"/>
+              <w:jc w:val="right"/>
+              <w:rPr>
+                <w:i/>
+                <w:iCs/>
+                <w:color w:val="000000" w:themeColor="text1"/>
+                <w:sz w:val="20"/>
+                <w:szCs w:val="20"/>
+              </w:rPr>
+            </w:pPr>
+            <w:r>
+              <w:rPr>
+                <w:i/>
+                <w:iCs/>
+                <w:color w:val="000000" w:themeColor="text1"/>
+                <w:sz w:val="20"/>
+                <w:szCs w:val="20"/>
+              </w:rPr>
+              <w:t>38.78</w:t>
+            </w:r>
+          </w:p>
+        </w:tc>
+        <w:tc>
+          <w:tcPr>
+            <w:tcW w:w="0" w:type="auto"/>
+            <w:hideMark/>
+          </w:tcPr>
+          <w:p>
+            <w:pPr>
+              <w:rPr>
+                <w:i/>
+                <w:iCs/>
+                <w:color w:val="000000" w:themeColor="text1"/>
+                <w:sz w:val="20"/>
+                <w:szCs w:val="20"/>
+              </w:rPr>
+            </w:pPr>
+            <w:r>
+              <w:rPr>
+                <w:b/>
+                <w:bCs/>
+                <w:i/>
+                <w:iCs/>
+                <w:color w:val="000000" w:themeColor="text1"/>
+                <w:sz w:val="20"/>
+                <w:szCs w:val="20"/>
+              </w:rPr>
+              <w:t>Social Interaction/Content Creation</w:t>
+            </w:r>
+          </w:p>
+        </w:tc>
+        <w:tc>
+          <w:tcPr>
+            <w:tcW w:w="0" w:type="auto"/>
+            <w:hideMark/>
+          </w:tcPr>
+          <w:p>
+            <w:pPr>
+              <w:ind w:firstLine="426"/>
+              <w:jc w:val="right"/>
+              <w:rPr>
+                <w:i/>
+                <w:iCs/>
+                <w:color w:val="000000" w:themeColor="text1"/>
+                <w:sz w:val="20"/>
+                <w:szCs w:val="20"/>
+              </w:rPr>
+            </w:pPr>
+          </w:p>
+        </w:tc>
+        <w:tc>
+          <w:tcPr>
+            <w:tcW w:w="0" w:type="auto"/>
+            <w:hideMark/>
+          </w:tcPr>
+          <w:p>
+            <w:pPr>
+              <w:ind w:firstLine="426"/>
+              <w:jc w:val="right"/>
+              <w:rPr>
+                <w:i/>
+                <w:iCs/>
+                <w:color w:val="000000" w:themeColor="text1"/>
+                <w:sz w:val="20"/>
+                <w:szCs w:val="20"/>
+              </w:rPr>
+            </w:pPr>
+          </w:p>
+        </w:tc>
+      </w:tr>
+      <w:tr>
+        <w:trPr>
+          <w:jc w:val="center"/>
+        </w:trPr>
+        <w:tc>
+          <w:tcPr>
+            <w:tcW w:w="0" w:type="auto"/>
+            <w:hideMark/>
+          </w:tcPr>
+          <w:p>
+            <w:pPr>
+              <w:ind w:firstLine="426"/>
+              <w:jc w:val="both"/>
+              <w:rPr>
+                <w:i/>
+                <w:iCs/>
+                <w:color w:val="000000" w:themeColor="text1"/>
+                <w:sz w:val="20"/>
+                <w:szCs w:val="20"/>
+              </w:rPr>
+            </w:pPr>
+          </w:p>
+        </w:tc>
+        <w:tc>
+          <w:tcPr>
+            <w:tcW w:w="0" w:type="auto"/>
+            <w:hideMark/>
+          </w:tcPr>
+          <w:p>
+            <w:pPr>
+              <w:ind w:firstLine="426"/>
+              <w:jc w:val="right"/>
+              <w:rPr>
+                <w:i/>
+                <w:iCs/>
+                <w:color w:val="000000" w:themeColor="text1"/>
+                <w:sz w:val="20"/>
+                <w:szCs w:val="20"/>
+              </w:rPr>
+            </w:pPr>
+          </w:p>
+        </w:tc>
+        <w:tc>
+          <w:tcPr>
+            <w:tcW w:w="0" w:type="auto"/>
+            <w:hideMark/>
+          </w:tcPr>
+          <w:p>
+            <w:pPr>
+              <w:ind w:firstLine="426"/>
+              <w:jc w:val="right"/>
+              <w:rPr>
+                <w:i/>
+                <w:iCs/>
+                <w:color w:val="000000" w:themeColor="text1"/>
+                <w:sz w:val="20"/>
+                <w:szCs w:val="20"/>
+              </w:rPr>
+            </w:pPr>
+          </w:p>
+        </w:tc>
+        <w:tc>
+          <w:tcPr>
+            <w:tcW w:w="0" w:type="auto"/>
+            <w:hideMark/>
+          </w:tcPr>
+          <w:p>
+            <w:pPr>
+              <w:rPr>
+                <w:i/>
+                <w:iCs/>
+                <w:color w:val="000000" w:themeColor="text1"/>
+                <w:sz w:val="20"/>
+                <w:szCs w:val="20"/>
+              </w:rPr>
+            </w:pPr>
+            <w:r>
+              <w:rPr>
+                <w:i/>
+                <w:iCs/>
+                <w:color w:val="000000" w:themeColor="text1"/>
+                <w:sz w:val="20"/>
+                <w:szCs w:val="20"/>
+              </w:rPr>
+              <w:t>Yes</w:t>
+            </w:r>
+          </w:p>
+        </w:tc>
+        <w:tc>
+          <w:tcPr>
+            <w:tcW w:w="0" w:type="auto"/>
+            <w:hideMark/>
+          </w:tcPr>
+          <w:p>
+            <w:pPr>
+              <w:ind w:firstLine="426"/>
+              <w:jc w:val="right"/>
+              <w:rPr>
+                <w:i/>
+                <w:iCs/>
+                <w:color w:val="000000" w:themeColor="text1"/>
+                <w:sz w:val="20"/>
+                <w:szCs w:val="20"/>
+              </w:rPr>
+            </w:pPr>
+            <w:r>
+              <w:rPr>
+                <w:i/>
+                <w:iCs/>
+                <w:color w:val="000000" w:themeColor="text1"/>
+                <w:sz w:val="20"/>
+                <w:szCs w:val="20"/>
+              </w:rPr>
+              <w:t>164</w:t>
+            </w:r>
+          </w:p>
+        </w:tc>
+        <w:tc>
+          <w:tcPr>
+            <w:tcW w:w="0" w:type="auto"/>
+            <w:hideMark/>
+          </w:tcPr>
+          <w:p>
+            <w:pPr>
+              <w:ind w:firstLine="426"/>
+              <w:jc w:val="right"/>
+              <w:rPr>
+                <w:i/>
+                <w:iCs/>
+                <w:color w:val="000000" w:themeColor="text1"/>
+                <w:sz w:val="20"/>
+                <w:szCs w:val="20"/>
+              </w:rPr>
+            </w:pPr>
+            <w:r>
+              <w:rPr>
+                <w:i/>
+                <w:iCs/>
+                <w:color w:val="000000" w:themeColor="text1"/>
+                <w:sz w:val="20"/>
+                <w:szCs w:val="20"/>
+              </w:rPr>
+              <w:t>52.56</w:t>
+            </w:r>
+          </w:p>
+        </w:tc>
+      </w:tr>
+      <w:tr>
+        <w:trPr>
+          <w:jc w:val="center"/>
+        </w:trPr>
+        <w:tc>
+          <w:tcPr>
+            <w:tcW w:w="0" w:type="auto"/>
+            <w:hideMark/>
+          </w:tcPr>
+          <w:p>
+            <w:pPr>
+              <w:jc w:val="both"/>
+              <w:rPr>
+                <w:i/>
+                <w:iCs/>
+                <w:color w:val="000000" w:themeColor="text1"/>
+                <w:sz w:val="20"/>
+                <w:szCs w:val="20"/>
+              </w:rPr>
+            </w:pPr>
+            <w:r>
+              <w:rPr>
+                <w:b/>
+                <w:bCs/>
+                <w:i/>
+                <w:iCs/>
+                <w:color w:val="000000" w:themeColor="text1"/>
+                <w:sz w:val="20"/>
+                <w:szCs w:val="20"/>
+              </w:rPr>
+              <w:t>Occupation</w:t>
+            </w:r>
+          </w:p>
+        </w:tc>
+        <w:tc>
+          <w:tcPr>
+            <w:tcW w:w="0" w:type="auto"/>
+            <w:hideMark/>
+          </w:tcPr>
+          <w:p>
+            <w:pPr>
+              <w:ind w:firstLine="426"/>
+              <w:jc w:val="right"/>
+              <w:rPr>
+                <w:i/>
+                <w:iCs/>
+                <w:color w:val="000000" w:themeColor="text1"/>
+                <w:sz w:val="20"/>
+                <w:szCs w:val="20"/>
+              </w:rPr>
+            </w:pPr>
+          </w:p>
+        </w:tc>
+        <w:tc>
+          <w:tcPr>
+            <w:tcW w:w="0" w:type="auto"/>
+            <w:hideMark/>
+          </w:tcPr>
+          <w:p>
+            <w:pPr>
+              <w:ind w:firstLine="426"/>
+              <w:jc w:val="right"/>
+              <w:rPr>
+                <w:i/>
+                <w:iCs/>
+                <w:color w:val="000000" w:themeColor="text1"/>
+                <w:sz w:val="20"/>
+                <w:szCs w:val="20"/>
+              </w:rPr>
+            </w:pPr>
+          </w:p>
+        </w:tc>
+        <w:tc>
+          <w:tcPr>
+            <w:tcW w:w="0" w:type="auto"/>
+            <w:hideMark/>
+          </w:tcPr>
+          <w:p>
+            <w:pPr>
+              <w:rPr>
+                <w:i/>
+                <w:iCs/>
+                <w:color w:val="000000" w:themeColor="text1"/>
+                <w:sz w:val="20"/>
+                <w:szCs w:val="20"/>
+              </w:rPr>
+            </w:pPr>
+            <w:r>
+              <w:rPr>
+                <w:i/>
+                <w:iCs/>
+                <w:color w:val="000000" w:themeColor="text1"/>
+                <w:sz w:val="20"/>
+                <w:szCs w:val="20"/>
+              </w:rPr>
+              <w:t>No</w:t>
+            </w:r>
+          </w:p>
+        </w:tc>
+        <w:tc>
+          <w:tcPr>
+            <w:tcW w:w="0" w:type="auto"/>
+            <w:hideMark/>
+          </w:tcPr>
+          <w:p>
+            <w:pPr>
+              <w:ind w:firstLine="426"/>
+              <w:jc w:val="right"/>
+              <w:rPr>
+                <w:i/>
+                <w:iCs/>
+                <w:color w:val="000000" w:themeColor="text1"/>
+                <w:sz w:val="20"/>
+                <w:szCs w:val="20"/>
+              </w:rPr>
+            </w:pPr>
+            <w:r>
+              <w:rPr>
+                <w:i/>
+                <w:iCs/>
+                <w:color w:val="000000" w:themeColor="text1"/>
+                <w:sz w:val="20"/>
+                <w:szCs w:val="20"/>
+              </w:rPr>
+              <w:t>148</w:t>
+            </w:r>
+          </w:p>
+        </w:tc>
+        <w:tc>
+          <w:tcPr>
+            <w:tcW w:w="0" w:type="auto"/>
+            <w:hideMark/>
+          </w:tcPr>
+          <w:p>
+            <w:pPr>
+              <w:ind w:firstLine="426"/>
+              <w:jc w:val="right"/>
+              <w:rPr>
+                <w:i/>
+                <w:iCs/>
+                <w:color w:val="000000" w:themeColor="text1"/>
+                <w:sz w:val="20"/>
+                <w:szCs w:val="20"/>
+              </w:rPr>
+            </w:pPr>
+            <w:r>
+              <w:rPr>
+                <w:i/>
+                <w:iCs/>
+                <w:color w:val="000000" w:themeColor="text1"/>
+                <w:sz w:val="20"/>
+                <w:szCs w:val="20"/>
+              </w:rPr>
+              <w:t>47.44</w:t>
+            </w:r>
+          </w:p>
+        </w:tc>
+      </w:tr>
+      <w:tr>
+        <w:trPr>
+          <w:jc w:val="center"/>
+        </w:trPr>
+        <w:tc>
+          <w:tcPr>
+            <w:tcW w:w="0" w:type="auto"/>
+            <w:hideMark/>
+          </w:tcPr>
+          <w:p>
+            <w:pPr>
+              <w:jc w:val="both"/>
+              <w:rPr>
+                <w:i/>
+                <w:iCs/>
+                <w:color w:val="000000" w:themeColor="text1"/>
+                <w:sz w:val="20"/>
+                <w:szCs w:val="20"/>
+              </w:rPr>
+            </w:pPr>
+            <w:r>
+              <w:rPr>
+                <w:i/>
+                <w:iCs/>
+                <w:color w:val="000000" w:themeColor="text1"/>
+                <w:sz w:val="20"/>
+                <w:szCs w:val="20"/>
+              </w:rPr>
+              <w:t>Students</w:t>
+            </w:r>
+          </w:p>
+        </w:tc>
+        <w:tc>
+          <w:tcPr>
+            <w:tcW w:w="0" w:type="auto"/>
+            <w:hideMark/>
+          </w:tcPr>
+          <w:p>
+            <w:pPr>
+              <w:ind w:firstLine="426"/>
+              <w:jc w:val="right"/>
+              <w:rPr>
+                <w:i/>
+                <w:iCs/>
+                <w:color w:val="000000" w:themeColor="text1"/>
+                <w:sz w:val="20"/>
+                <w:szCs w:val="20"/>
+              </w:rPr>
+            </w:pPr>
+            <w:r>
+              <w:rPr>
+                <w:i/>
+                <w:iCs/>
+                <w:color w:val="000000" w:themeColor="text1"/>
+                <w:sz w:val="20"/>
+                <w:szCs w:val="20"/>
+              </w:rPr>
+              <w:t>88</w:t>
+            </w:r>
+          </w:p>
+        </w:tc>
+        <w:tc>
+          <w:tcPr>
+            <w:tcW w:w="0" w:type="auto"/>
+            <w:hideMark/>
+          </w:tcPr>
+          <w:p>
+            <w:pPr>
+              <w:ind w:firstLine="426"/>
+              <w:jc w:val="right"/>
+              <w:rPr>
+                <w:i/>
+                <w:iCs/>
+                <w:color w:val="000000" w:themeColor="text1"/>
+                <w:sz w:val="20"/>
+                <w:szCs w:val="20"/>
+              </w:rPr>
+            </w:pPr>
+            <w:r>
+              <w:rPr>
+                <w:i/>
+                <w:iCs/>
+                <w:color w:val="000000" w:themeColor="text1"/>
+                <w:sz w:val="20"/>
+                <w:szCs w:val="20"/>
+              </w:rPr>
+              <w:t>28.21</w:t>
+            </w:r>
+          </w:p>
+        </w:tc>
+        <w:tc>
+          <w:tcPr>
+            <w:tcW w:w="0" w:type="auto"/>
+            <w:hideMark/>
+          </w:tcPr>
+          <w:p>
+            <w:pPr>
+              <w:rPr>
+                <w:i/>
+                <w:iCs/>
+                <w:color w:val="000000" w:themeColor="text1"/>
+                <w:sz w:val="20"/>
+                <w:szCs w:val="20"/>
+              </w:rPr>
+            </w:pPr>
+            <w:r>
+              <w:rPr>
+                <w:b/>
+                <w:bCs/>
+                <w:i/>
+                <w:iCs/>
+                <w:color w:val="000000" w:themeColor="text1"/>
+                <w:sz w:val="20"/>
+                <w:szCs w:val="20"/>
+              </w:rPr>
+              <w:t>Monthly Family Income</w:t>
+            </w:r>
+          </w:p>
+        </w:tc>
+        <w:tc>
+          <w:tcPr>
+            <w:tcW w:w="0" w:type="auto"/>
+            <w:hideMark/>
+          </w:tcPr>
+          <w:p>
+            <w:pPr>
+              <w:ind w:firstLine="426"/>
+              <w:jc w:val="right"/>
+              <w:rPr>
+                <w:i/>
+                <w:iCs/>
+                <w:color w:val="000000" w:themeColor="text1"/>
+                <w:sz w:val="20"/>
+                <w:szCs w:val="20"/>
+              </w:rPr>
+            </w:pPr>
+          </w:p>
+        </w:tc>
+        <w:tc>
+          <w:tcPr>
+            <w:tcW w:w="0" w:type="auto"/>
+            <w:hideMark/>
+          </w:tcPr>
+          <w:p>
+            <w:pPr>
+              <w:ind w:firstLine="426"/>
+              <w:jc w:val="right"/>
+              <w:rPr>
+                <w:i/>
+                <w:iCs/>
+                <w:color w:val="000000" w:themeColor="text1"/>
+                <w:sz w:val="20"/>
+                <w:szCs w:val="20"/>
+              </w:rPr>
+            </w:pPr>
+          </w:p>
+        </w:tc>
+      </w:tr>
+      <w:tr>
+        <w:trPr>
+          <w:jc w:val="center"/>
+        </w:trPr>
+        <w:tc>
+          <w:tcPr>
+            <w:tcW w:w="0" w:type="auto"/>
+            <w:hideMark/>
+          </w:tcPr>
+          <w:p>
+            <w:pPr>
+              <w:jc w:val="both"/>
+              <w:rPr>
+                <w:i/>
+                <w:iCs/>
+                <w:color w:val="000000" w:themeColor="text1"/>
+                <w:sz w:val="20"/>
+                <w:szCs w:val="20"/>
+              </w:rPr>
+            </w:pPr>
+            <w:r>
+              <w:rPr>
+                <w:i/>
+                <w:iCs/>
+                <w:color w:val="000000" w:themeColor="text1"/>
+                <w:sz w:val="20"/>
+                <w:szCs w:val="20"/>
+              </w:rPr>
+              <w:t>Job</w:t>
+            </w:r>
+          </w:p>
+        </w:tc>
+        <w:tc>
+          <w:tcPr>
+            <w:tcW w:w="0" w:type="auto"/>
+            <w:hideMark/>
+          </w:tcPr>
+          <w:p>
+            <w:pPr>
+              <w:ind w:firstLine="426"/>
+              <w:jc w:val="right"/>
+              <w:rPr>
+                <w:i/>
+                <w:iCs/>
+                <w:color w:val="000000" w:themeColor="text1"/>
+                <w:sz w:val="20"/>
+                <w:szCs w:val="20"/>
+              </w:rPr>
+            </w:pPr>
+            <w:r>
+              <w:rPr>
+                <w:i/>
+                <w:iCs/>
+                <w:color w:val="000000" w:themeColor="text1"/>
+                <w:sz w:val="20"/>
+                <w:szCs w:val="20"/>
+              </w:rPr>
+              <w:t>102</w:t>
+            </w:r>
+          </w:p>
+        </w:tc>
+        <w:tc>
+          <w:tcPr>
+            <w:tcW w:w="0" w:type="auto"/>
+            <w:hideMark/>
+          </w:tcPr>
+          <w:p>
+            <w:pPr>
+              <w:ind w:firstLine="426"/>
+              <w:jc w:val="right"/>
+              <w:rPr>
+                <w:i/>
+                <w:iCs/>
+                <w:color w:val="000000" w:themeColor="text1"/>
+                <w:sz w:val="20"/>
+                <w:szCs w:val="20"/>
+              </w:rPr>
+            </w:pPr>
+            <w:r>
+              <w:rPr>
+                <w:i/>
+                <w:iCs/>
+                <w:color w:val="000000" w:themeColor="text1"/>
+                <w:sz w:val="20"/>
+                <w:szCs w:val="20"/>
+              </w:rPr>
+              <w:t>32.69</w:t>
+            </w:r>
+          </w:p>
+        </w:tc>
+        <w:tc>
+          <w:tcPr>
+            <w:tcW w:w="0" w:type="auto"/>
+            <w:hideMark/>
+          </w:tcPr>
+          <w:p>
+            <w:pPr>
+              <w:rPr>
+                <w:i/>
+                <w:iCs/>
+                <w:color w:val="000000" w:themeColor="text1"/>
+                <w:sz w:val="20"/>
+                <w:szCs w:val="20"/>
+              </w:rPr>
+            </w:pPr>
+            <w:r>
+              <w:rPr>
+                <w:i/>
+                <w:iCs/>
+                <w:color w:val="000000" w:themeColor="text1"/>
+                <w:sz w:val="20"/>
+                <w:szCs w:val="20"/>
+              </w:rPr>
+              <w:t>INR 30,000 or less</w:t>
+            </w:r>
+          </w:p>
+        </w:tc>
+        <w:tc>
+          <w:tcPr>
+            <w:tcW w:w="0" w:type="auto"/>
+            <w:hideMark/>
+          </w:tcPr>
+          <w:p>
+            <w:pPr>
+              <w:ind w:firstLine="426"/>
+              <w:jc w:val="right"/>
+              <w:rPr>
+                <w:i/>
+                <w:iCs/>
+                <w:color w:val="000000" w:themeColor="text1"/>
+                <w:sz w:val="20"/>
+                <w:szCs w:val="20"/>
+              </w:rPr>
+            </w:pPr>
+            <w:r>
+              <w:rPr>
+                <w:i/>
+                <w:iCs/>
+                <w:color w:val="000000" w:themeColor="text1"/>
+                <w:sz w:val="20"/>
+                <w:szCs w:val="20"/>
+              </w:rPr>
+              <w:t>57</w:t>
+            </w:r>
+          </w:p>
+        </w:tc>
+        <w:tc>
+          <w:tcPr>
+            <w:tcW w:w="0" w:type="auto"/>
+            <w:hideMark/>
+          </w:tcPr>
+          <w:p>
+            <w:pPr>
+              <w:ind w:firstLine="426"/>
+              <w:jc w:val="right"/>
+              <w:rPr>
+                <w:i/>
+                <w:iCs/>
+                <w:color w:val="000000" w:themeColor="text1"/>
+                <w:sz w:val="20"/>
+                <w:szCs w:val="20"/>
+              </w:rPr>
+            </w:pPr>
+            <w:r>
+              <w:rPr>
+                <w:i/>
+                <w:iCs/>
+                <w:color w:val="000000" w:themeColor="text1"/>
+                <w:sz w:val="20"/>
+                <w:szCs w:val="20"/>
+              </w:rPr>
+              <w:t>18.40</w:t>
+            </w:r>
+          </w:p>
+        </w:tc>
+      </w:tr>
+      <w:tr>
+        <w:trPr>
+          <w:jc w:val="center"/>
+        </w:trPr>
+        <w:tc>
+          <w:tcPr>
+            <w:tcW w:w="0" w:type="auto"/>
+            <w:hideMark/>
+          </w:tcPr>
+          <w:p>
+            <w:pPr>
+              <w:jc w:val="both"/>
+              <w:rPr>
+                <w:i/>
+                <w:iCs/>
+                <w:color w:val="000000" w:themeColor="text1"/>
+                <w:sz w:val="20"/>
+                <w:szCs w:val="20"/>
+              </w:rPr>
+            </w:pPr>
+            <w:r>
+              <w:rPr>
+                <w:i/>
+                <w:iCs/>
+                <w:color w:val="000000" w:themeColor="text1"/>
+                <w:sz w:val="20"/>
+                <w:szCs w:val="20"/>
+              </w:rPr>
+              <w:t>Business</w:t>
+            </w:r>
+          </w:p>
+        </w:tc>
+        <w:tc>
+          <w:tcPr>
+            <w:tcW w:w="0" w:type="auto"/>
+            <w:hideMark/>
+          </w:tcPr>
+          <w:p>
+            <w:pPr>
+              <w:ind w:firstLine="426"/>
+              <w:jc w:val="right"/>
+              <w:rPr>
+                <w:i/>
+                <w:iCs/>
+                <w:color w:val="000000" w:themeColor="text1"/>
+                <w:sz w:val="20"/>
+                <w:szCs w:val="20"/>
+              </w:rPr>
+            </w:pPr>
+            <w:r>
+              <w:rPr>
+                <w:i/>
+                <w:iCs/>
+                <w:color w:val="000000" w:themeColor="text1"/>
+                <w:sz w:val="20"/>
+                <w:szCs w:val="20"/>
+              </w:rPr>
+              <w:t>122</w:t>
+            </w:r>
+          </w:p>
+        </w:tc>
+        <w:tc>
+          <w:tcPr>
+            <w:tcW w:w="0" w:type="auto"/>
+            <w:hideMark/>
+          </w:tcPr>
+          <w:p>
+            <w:pPr>
+              <w:ind w:firstLine="426"/>
+              <w:jc w:val="right"/>
+              <w:rPr>
+                <w:i/>
+                <w:iCs/>
+                <w:color w:val="000000" w:themeColor="text1"/>
+                <w:sz w:val="20"/>
+                <w:szCs w:val="20"/>
+              </w:rPr>
+            </w:pPr>
+            <w:r>
+              <w:rPr>
+                <w:i/>
+                <w:iCs/>
+                <w:color w:val="000000" w:themeColor="text1"/>
+                <w:sz w:val="20"/>
+                <w:szCs w:val="20"/>
+              </w:rPr>
+              <w:t>39.10</w:t>
+            </w:r>
+          </w:p>
+        </w:tc>
+        <w:tc>
+          <w:tcPr>
+            <w:tcW w:w="0" w:type="auto"/>
+            <w:hideMark/>
+          </w:tcPr>
+          <w:p>
+            <w:pPr>
+              <w:rPr>
+                <w:i/>
+                <w:iCs/>
+                <w:color w:val="000000" w:themeColor="text1"/>
+                <w:sz w:val="20"/>
+                <w:szCs w:val="20"/>
+              </w:rPr>
+            </w:pPr>
+            <w:r>
+              <w:rPr>
+                <w:i/>
+                <w:iCs/>
+                <w:color w:val="000000" w:themeColor="text1"/>
+                <w:sz w:val="20"/>
+                <w:szCs w:val="20"/>
+              </w:rPr>
+              <w:t>INR 30,001–50,000</w:t>
+            </w:r>
+          </w:p>
+        </w:tc>
+        <w:tc>
+          <w:tcPr>
+            <w:tcW w:w="0" w:type="auto"/>
+            <w:hideMark/>
+          </w:tcPr>
+          <w:p>
+            <w:pPr>
+              <w:ind w:firstLine="426"/>
+              <w:jc w:val="right"/>
+              <w:rPr>
+                <w:i/>
+                <w:iCs/>
+                <w:color w:val="000000" w:themeColor="text1"/>
+                <w:sz w:val="20"/>
+                <w:szCs w:val="20"/>
+              </w:rPr>
+            </w:pPr>
+            <w:r>
+              <w:rPr>
+                <w:i/>
+                <w:iCs/>
+                <w:color w:val="000000" w:themeColor="text1"/>
+                <w:sz w:val="20"/>
+                <w:szCs w:val="20"/>
+              </w:rPr>
+              <w:t>80</w:t>
+            </w:r>
+          </w:p>
+        </w:tc>
+        <w:tc>
+          <w:tcPr>
+            <w:tcW w:w="0" w:type="auto"/>
+            <w:hideMark/>
+          </w:tcPr>
+          <w:p>
+            <w:pPr>
+              <w:ind w:firstLine="426"/>
+              <w:jc w:val="right"/>
+              <w:rPr>
+                <w:i/>
+                <w:iCs/>
+                <w:color w:val="000000" w:themeColor="text1"/>
+                <w:sz w:val="20"/>
+                <w:szCs w:val="20"/>
+              </w:rPr>
+            </w:pPr>
+            <w:r>
+              <w:rPr>
+                <w:i/>
+                <w:iCs/>
+                <w:color w:val="000000" w:themeColor="text1"/>
+                <w:sz w:val="20"/>
+                <w:szCs w:val="20"/>
+              </w:rPr>
+              <w:t>25.64</w:t>
+            </w:r>
+          </w:p>
+        </w:tc>
+      </w:tr>
+      <w:tr>
+        <w:trPr>
+          <w:jc w:val="center"/>
+        </w:trPr>
+        <w:tc>
+          <w:tcPr>
+            <w:tcW w:w="0" w:type="auto"/>
+            <w:hideMark/>
+          </w:tcPr>
+          <w:p>
+            <w:pPr>
+              <w:ind w:firstLine="426"/>
+              <w:jc w:val="both"/>
+              <w:rPr>
+                <w:i/>
+                <w:iCs/>
+                <w:color w:val="000000" w:themeColor="text1"/>
+                <w:sz w:val="20"/>
+                <w:szCs w:val="20"/>
+              </w:rPr>
+            </w:pPr>
+          </w:p>
+        </w:tc>
+        <w:tc>
+          <w:tcPr>
+            <w:tcW w:w="0" w:type="auto"/>
+            <w:hideMark/>
+          </w:tcPr>
+          <w:p>
+            <w:pPr>
+              <w:ind w:firstLine="426"/>
+              <w:jc w:val="both"/>
+              <w:rPr>
+                <w:i/>
+                <w:iCs/>
+                <w:color w:val="000000" w:themeColor="text1"/>
+                <w:sz w:val="20"/>
+                <w:szCs w:val="20"/>
+              </w:rPr>
+            </w:pPr>
+          </w:p>
+        </w:tc>
+        <w:tc>
+          <w:tcPr>
+            <w:tcW w:w="0" w:type="auto"/>
+            <w:hideMark/>
+          </w:tcPr>
+          <w:p>
+            <w:pPr>
+              <w:ind w:firstLine="426"/>
+              <w:jc w:val="both"/>
+              <w:rPr>
+                <w:i/>
+                <w:iCs/>
+                <w:color w:val="000000" w:themeColor="text1"/>
+                <w:sz w:val="20"/>
+                <w:szCs w:val="20"/>
+              </w:rPr>
+            </w:pPr>
+          </w:p>
+        </w:tc>
+        <w:tc>
+          <w:tcPr>
+            <w:tcW w:w="0" w:type="auto"/>
+            <w:hideMark/>
+          </w:tcPr>
+          <w:p>
+            <w:pPr>
+              <w:rPr>
+                <w:i/>
+                <w:iCs/>
+                <w:color w:val="000000" w:themeColor="text1"/>
+                <w:sz w:val="20"/>
+                <w:szCs w:val="20"/>
+              </w:rPr>
+            </w:pPr>
+            <w:r>
+              <w:rPr>
+                <w:i/>
+                <w:iCs/>
+                <w:color w:val="000000" w:themeColor="text1"/>
+                <w:sz w:val="20"/>
+                <w:szCs w:val="20"/>
+              </w:rPr>
+              <w:t>INR 50,001–80,000</w:t>
+            </w:r>
+          </w:p>
+        </w:tc>
+        <w:tc>
+          <w:tcPr>
+            <w:tcW w:w="0" w:type="auto"/>
+            <w:hideMark/>
+          </w:tcPr>
+          <w:p>
+            <w:pPr>
+              <w:ind w:firstLine="426"/>
+              <w:jc w:val="right"/>
+              <w:rPr>
+                <w:i/>
+                <w:iCs/>
+                <w:color w:val="000000" w:themeColor="text1"/>
+                <w:sz w:val="20"/>
+                <w:szCs w:val="20"/>
+              </w:rPr>
+            </w:pPr>
+            <w:r>
+              <w:rPr>
+                <w:i/>
+                <w:iCs/>
+                <w:color w:val="000000" w:themeColor="text1"/>
+                <w:sz w:val="20"/>
+                <w:szCs w:val="20"/>
+              </w:rPr>
+              <w:t>100</w:t>
+            </w:r>
+          </w:p>
+        </w:tc>
+        <w:tc>
+          <w:tcPr>
+            <w:tcW w:w="0" w:type="auto"/>
+            <w:hideMark/>
+          </w:tcPr>
+          <w:p>
+            <w:pPr>
+              <w:ind w:firstLine="426"/>
+              <w:jc w:val="right"/>
+              <w:rPr>
+                <w:i/>
+                <w:iCs/>
+                <w:color w:val="000000" w:themeColor="text1"/>
+                <w:sz w:val="20"/>
+                <w:szCs w:val="20"/>
+              </w:rPr>
+            </w:pPr>
+            <w:r>
+              <w:rPr>
+                <w:i/>
+                <w:iCs/>
+                <w:color w:val="000000" w:themeColor="text1"/>
+                <w:sz w:val="20"/>
+                <w:szCs w:val="20"/>
+              </w:rPr>
+              <w:t>32.05</w:t>
+            </w:r>
+          </w:p>
+        </w:tc>
+      </w:tr>
+      <w:tr>
+        <w:trPr>
+          <w:jc w:val="center"/>
+        </w:trPr>
+        <w:tc>
+          <w:tcPr>
+            <w:tcW w:w="0" w:type="auto"/>
+            <w:hideMark/>
+          </w:tcPr>
+          <w:p>
+            <w:pPr>
+              <w:ind w:firstLine="426"/>
+              <w:jc w:val="both"/>
+              <w:rPr>
+                <w:i/>
+                <w:iCs/>
+                <w:color w:val="000000" w:themeColor="text1"/>
+                <w:sz w:val="20"/>
+                <w:szCs w:val="20"/>
+              </w:rPr>
+            </w:pPr>
+          </w:p>
+        </w:tc>
+        <w:tc>
+          <w:tcPr>
+            <w:tcW w:w="0" w:type="auto"/>
+            <w:hideMark/>
+          </w:tcPr>
+          <w:p>
+            <w:pPr>
+              <w:ind w:firstLine="426"/>
+              <w:jc w:val="both"/>
+              <w:rPr>
+                <w:i/>
+                <w:iCs/>
+                <w:color w:val="000000" w:themeColor="text1"/>
+                <w:sz w:val="20"/>
+                <w:szCs w:val="20"/>
+              </w:rPr>
+            </w:pPr>
+          </w:p>
+        </w:tc>
+        <w:tc>
+          <w:tcPr>
+            <w:tcW w:w="0" w:type="auto"/>
+            <w:hideMark/>
+          </w:tcPr>
+          <w:p>
+            <w:pPr>
+              <w:ind w:firstLine="426"/>
+              <w:jc w:val="both"/>
+              <w:rPr>
+                <w:i/>
+                <w:iCs/>
+                <w:color w:val="000000" w:themeColor="text1"/>
+                <w:sz w:val="20"/>
+                <w:szCs w:val="20"/>
+              </w:rPr>
+            </w:pPr>
+          </w:p>
+        </w:tc>
+        <w:tc>
+          <w:tcPr>
+            <w:tcW w:w="0" w:type="auto"/>
+            <w:hideMark/>
+          </w:tcPr>
+          <w:p>
+            <w:pPr>
+              <w:rPr>
+                <w:i/>
+                <w:iCs/>
+                <w:color w:val="000000" w:themeColor="text1"/>
+                <w:sz w:val="20"/>
+                <w:szCs w:val="20"/>
+              </w:rPr>
+            </w:pPr>
+            <w:r>
+              <w:rPr>
+                <w:i/>
+                <w:iCs/>
+                <w:color w:val="000000" w:themeColor="text1"/>
+                <w:sz w:val="20"/>
+                <w:szCs w:val="20"/>
+              </w:rPr>
+              <w:t>INR 80,001 and above</w:t>
+            </w:r>
+          </w:p>
+        </w:tc>
+        <w:tc>
+          <w:tcPr>
+            <w:tcW w:w="0" w:type="auto"/>
+            <w:hideMark/>
+          </w:tcPr>
+          <w:p>
+            <w:pPr>
+              <w:ind w:firstLine="426"/>
+              <w:jc w:val="right"/>
+              <w:rPr>
+                <w:i/>
+                <w:iCs/>
+                <w:color w:val="000000" w:themeColor="text1"/>
+                <w:sz w:val="20"/>
+                <w:szCs w:val="20"/>
+              </w:rPr>
+            </w:pPr>
+            <w:r>
+              <w:rPr>
+                <w:i/>
+                <w:iCs/>
+                <w:color w:val="000000" w:themeColor="text1"/>
+                <w:sz w:val="20"/>
+                <w:szCs w:val="20"/>
+              </w:rPr>
+              <w:t>75</w:t>
+            </w:r>
+          </w:p>
+        </w:tc>
+        <w:tc>
+          <w:tcPr>
+            <w:tcW w:w="0" w:type="auto"/>
+            <w:hideMark/>
+          </w:tcPr>
+          <w:p>
+            <w:pPr>
+              <w:ind w:firstLine="426"/>
+              <w:jc w:val="right"/>
+              <w:rPr>
+                <w:i/>
+                <w:iCs/>
+                <w:color w:val="000000" w:themeColor="text1"/>
+                <w:sz w:val="20"/>
+                <w:szCs w:val="20"/>
+              </w:rPr>
+            </w:pPr>
+            <w:r>
+              <w:rPr>
+                <w:i/>
+                <w:iCs/>
+                <w:color w:val="000000" w:themeColor="text1"/>
+                <w:sz w:val="20"/>
+                <w:szCs w:val="20"/>
+              </w:rPr>
+              <w:t>23.91</w:t>
+            </w:r>
+          </w:p>
+        </w:tc>
+      </w:tr>
+    </w:tbl>
     <w:p>
       <w:pPr>
         <w:spacing w:line="360" w:lineRule="auto"/>
@@ -1600,7 +5204,7 @@
           <w:sz w:val="20"/>
           <w:szCs w:val="20"/>
         </w:rPr>
-        <w:t>All standardised loadings were positive and significant (p &lt; .001), and Cronbach’s alpha ranged from 0.765 to 0.903 across the four constructs, exceeding the conventional benchmark (Nunnally and Bernstein, 1994). Detailed measurement properties, including average variance extracted (Fornell and Larcker, 1981), are reported in Table 1 following the conventions of Hair et al. (2019). Discriminant validity was assessed using the heterotrait–monotrait (HTMT) ratio (Henseler et al., 2015) obtained from SmartPLS 4.1 bootstrapping with 5,000 subsamples: all ratios fell below the 0.85 criterion (BSAT–BSUC 0.743; UX–BSAT 0.768; UX–BSUC 0.712; UE–BSAT 0.756; UE–BSUC 0.729; UE–UX 0.814), confirming that the constructs are empirically distinct.</w:t>
+        <w:t>Source: Authors</w:t>
       </w:r>
     </w:p>
     <w:p>
@@ -1634,7 +5238,54 @@
           <w:iCs/>
           <w:color w:val="000000" w:themeColor="text1"/>
         </w:rPr>
-        <w:t>Table 1. Measurement model: item loadings, reliability and average variance extracted</w:t>
+        <w:t>5.2 Measurement model assessment</w:t>
+      </w:r>
+    </w:p>
+    <w:p>
+      <w:pPr>
+        <w:spacing w:line="360" w:lineRule="auto"/>
+        <w:jc w:val="both"/>
+        <w:rPr>
+          <w:color w:val="000000" w:themeColor="text1"/>
+        </w:rPr>
+      </w:pPr>
+      <w:r>
+        <w:rPr>
+          <w:color w:val="000000" w:themeColor="text1"/>
+        </w:rPr>
+        <w:t>All standardised loadings were positive and significant (p &lt; .001), and Cronbach’s alpha ranged from 0.765 to 0.903 across the four constructs, exceeding the conventional benchmark (Nunnally and Bernstein, 1994). Detailed measurement properties, including average variance extracted (Fornell and Larcker, 1981), are reported in Table 2 following the conventions of Hair et al. (2019). Discriminant validity was assessed using the heterotrait–monotrait (HTMT) ratio (Henseler et al., 2015) obtained from SmartPLS 4.1 bootstrapping with 5,000 subsamples: all ratios fell below the 0.85 criterion (BSAT–BSUC 0.743; UX–BSAT 0.768; UX–BSUC 0.712; UE–BSAT 0.756; UE–BSUC 0.729; UE–UX 0.814), confirming that the constructs are empirically distinct.</w:t>
+      </w:r>
+    </w:p>
+    <w:p>
+      <w:pPr>
+        <w:spacing w:line="360" w:lineRule="auto"/>
+        <w:jc w:val="both"/>
+        <w:rPr>
+          <w:color w:val="000000" w:themeColor="text1"/>
+        </w:rPr>
+      </w:pPr>
+    </w:p>
+    <w:p>
+      <w:pPr>
+        <w:spacing w:line="360" w:lineRule="auto"/>
+        <w:jc w:val="both"/>
+        <w:rPr>
+          <w:b/>
+          <w:bCs/>
+          <w:i/>
+          <w:iCs/>
+          <w:color w:val="000000" w:themeColor="text1"/>
+        </w:rPr>
+      </w:pPr>
+      <w:r>
+        <w:rPr>
+          <w:b/>
+          <w:bCs/>
+          <w:i/>
+          <w:iCs/>
+          <w:color w:val="000000" w:themeColor="text1"/>
+        </w:rPr>
+        <w:t>Table 2. Measurement model: item loadings, reliability and average variance extracted</w:t>
       </w:r>
     </w:p>
     <w:tbl>
@@ -8569,7 +12220,7 @@
           <w:i/>
           <w:iCs/>
         </w:rPr>
-        <w:t>Table 2. Necessity and sufficiency analysis of conditions and configurations for high brand success (BSUC)</w:t>
+        <w:t>Table 3. Necessity and sufficiency analysis of conditions and configurations for high brand success (BSUC)</w:t>
       </w:r>
     </w:p>
     <w:tbl>
@@ -9849,7 +13500,7 @@
         </w:rPr>
       </w:pPr>
       <w:r>
-        <w:t>Table 2 reports the intermediate solution for BSUC = f(BSAT, UX, UE). Three two-condition configurations—BSAT × UX, BSAT × UE and UX × UE—are each sufficient for high brand success and together account for approximately 32% of the outcome, at an overall solution consistency of 0.756.</w:t>
+        <w:t>Table 3 reports the intermediate solution for BSUC = f(BSAT, UX, UE). Three two-condition configurations—BSAT × UX, BSAT × UE and UX × UE—are each sufficient for high brand success and together account for approximately 32% of the outcome, at an overall solution consistency of 0.756.</w:t>
       </w:r>
     </w:p>
     <w:p>
@@ -9953,7 +13604,7 @@
         </w:rPr>
       </w:pPr>
       <w:r>
-        <w:t>Necessity analysis establishes whether a condition must be present for the outcome to occur; a condition qualifies as necessary only if its consistency exceeds 0.90 (Schneider and Wagemann, 2012). As Table 2 shows, none of the single conditions approaches that threshold. High brand success therefore depends on combinations rather than on any individually essential condition, which motivates the sufficiency analysis.</w:t>
+        <w:t>Necessity analysis establishes whether a condition must be present for the outcome to occur; a condition qualifies as necessary only if its consistency exceeds 0.90 (Schneider and Wagemann, 2012). As Table 3 shows, none of the single conditions approaches that threshold. High brand success therefore depends on combinations rather than on any individually essential condition, which motivates the sufficiency analysis.</w:t>
       </w:r>
     </w:p>
     <w:p>
@@ -9993,7 +13644,7 @@
         </w:rPr>
       </w:pPr>
       <w:r>
-        <w:t>The sufficiency analysis identifies the configurations that are jointly sufficient. UE, UX and BSAT were entered into the truth table with consistency and frequency thresholds applied (Ragin, 2008; Schneider and Wagemann, 2012). As Table 2 reports, brand satisfaction appears in every high-consistency sufficient path, whereas engagement and experience contribute in combination rather than in isolation—a pattern consistent with prior evidence on engagement–loyalty links (Jeong and Kim, 2019) and social-media effects on customer equity (Ebrahim, 2020).</w:t>
+        <w:t>The sufficiency analysis identifies the configurations that are jointly sufficient. UE, UX and BSAT were entered into the truth table with consistency and frequency thresholds applied (Ragin, 2008; Schneider and Wagemann, 2012). As Table 3 reports, brand satisfaction appears in every high-consistency sufficient path, whereas engagement and experience contribute in combination rather than in isolation—a pattern consistent with prior evidence on engagement–loyalty links (Jeong and Kim, 2019) and social-media effects on customer equity (Ebrahim, 2020).</w:t>
       </w:r>
     </w:p>
     <w:p>
@@ -10041,7 +13692,7 @@
         <w:jc w:val="both"/>
       </w:pPr>
       <w:r>
-        <w:t>fsQCA tests sufficiency rather than net linear effects, so the hypotheses are evaluated configurationally against Table 2. Consistent with the necessity result, user engagement and user experience are not sufficient in isolation; they support brand success only in combination, which supports H1 and H2 within sufficient configurations. Brand satisfaction appears in every high-consistency path and records the highest single-condition consistency, indicating the central, mediation-consistent role posited in H3. The presence of three sufficient configurations rather than one necessary condition supports the equifinality proposition (P1). A formal bootstrap mediation test would provide a useful complement.</w:t>
+        <w:t>fsQCA tests sufficiency rather than net linear effects, so the hypotheses are evaluated configurationally against Table 3. Consistent with the necessity result, user engagement and user experience are not sufficient in isolation; they support brand success only in combination, which supports H1 and H2 within sufficient configurations. Brand satisfaction appears in every high-consistency path and records the highest single-condition consistency, indicating the central, mediation-consistent role posited in H3. The presence of three sufficient configurations rather than one necessary condition supports the equifinality proposition (P1). A formal bootstrap mediation test would provide a useful complement.</w:t>
       </w:r>
     </w:p>
     <w:p>

</xml_diff>

<commit_message>
Add outline levels to all headings for navigation
The manuscript formats headings manually (bold Times New Roman) instead of using Word's
Heading styles, so the navigation pane and any generated table of contents showed no
structure, making sections appear absent when the file is skimmed. Outline levels and
keep-with-next are now set on all 30 headings; on-page appearance is unchanged.

Content is unaltered: section 5 (Data analysis and results) with 5.1-5.4, all three tables
and all three figures are present. Submission count unchanged at 7,687 words.
</commit_message>
<xml_diff>
--- a/JCM_Manuscript_Revised.docx
+++ b/JCM_Manuscript_Revised.docx
@@ -199,8 +199,10 @@
     </w:p>
     <w:p>
       <w:pPr>
+        <w:keepNext/>
         <w:spacing w:after="0" w:line="360" w:lineRule="auto"/>
         <w:jc w:val="both"/>
+        <w:outlineLvl w:val="0"/>
         <w:rPr>
           <w:rFonts w:ascii="Times New Roman" w:hAnsi="Times New Roman" w:cs="Times New Roman"/>
           <w:b/>
@@ -312,8 +314,10 @@
     </w:p>
     <w:p>
       <w:pPr>
+        <w:keepNext/>
         <w:spacing w:line="360" w:lineRule="auto"/>
         <w:jc w:val="both"/>
+        <w:outlineLvl w:val="0"/>
         <w:rPr>
           <w:b/>
           <w:bCs/>
@@ -331,11 +335,13 @@
     </w:p>
     <w:p>
       <w:pPr>
+        <w:keepNext/>
         <w:autoSpaceDE w:val="0"/>
         <w:autoSpaceDN w:val="0"/>
         <w:adjustRightInd w:val="0"/>
         <w:spacing w:line="360" w:lineRule="auto"/>
         <w:jc w:val="both"/>
+        <w:outlineLvl w:val="1"/>
         <w:rPr>
           <w:b/>
           <w:bCs/>
@@ -388,8 +394,10 @@
     </w:p>
     <w:p>
       <w:pPr>
+        <w:keepNext/>
         <w:spacing w:line="360" w:lineRule="auto"/>
         <w:jc w:val="both"/>
+        <w:outlineLvl w:val="1"/>
         <w:rPr>
           <w:b/>
           <w:bCs/>
@@ -601,8 +609,10 @@
     </w:p>
     <w:p>
       <w:pPr>
+        <w:keepNext/>
         <w:spacing w:line="360" w:lineRule="auto"/>
         <w:jc w:val="both"/>
+        <w:outlineLvl w:val="1"/>
         <w:rPr>
           <w:i/>
           <w:iCs/>
@@ -692,8 +702,10 @@
     </w:p>
     <w:p>
       <w:pPr>
+        <w:keepNext/>
         <w:spacing w:line="360" w:lineRule="auto"/>
         <w:jc w:val="both"/>
+        <w:outlineLvl w:val="1"/>
         <w:rPr>
           <w:b/>
           <w:bCs/>
@@ -755,8 +767,10 @@
     </w:p>
     <w:p>
       <w:pPr>
+        <w:keepNext/>
         <w:spacing w:after="0" w:line="360" w:lineRule="auto"/>
         <w:jc w:val="both"/>
+        <w:outlineLvl w:val="0"/>
         <w:rPr>
           <w:rFonts w:ascii="Times New Roman" w:hAnsi="Times New Roman" w:cs="Times New Roman"/>
           <w:b/>
@@ -780,8 +794,10 @@
     </w:p>
     <w:p>
       <w:pPr>
+        <w:keepNext/>
         <w:spacing w:line="360" w:lineRule="auto"/>
         <w:jc w:val="both"/>
+        <w:outlineLvl w:val="1"/>
         <w:rPr>
           <w:b/>
           <w:bCs/>
@@ -844,8 +860,10 @@
     </w:p>
     <w:p>
       <w:pPr>
+        <w:keepNext/>
         <w:spacing w:after="0" w:line="360" w:lineRule="auto"/>
         <w:jc w:val="both"/>
+        <w:outlineLvl w:val="1"/>
         <w:rPr>
           <w:rFonts w:ascii="Times New Roman" w:hAnsi="Times New Roman" w:cs="Times New Roman"/>
           <w:b/>
@@ -904,6 +922,10 @@
       </w:r>
     </w:p>
     <w:p>
+      <w:pPr>
+        <w:keepNext/>
+        <w:outlineLvl w:val="1"/>
+      </w:pPr>
       <w:r>
         <w:rPr>
           <w:b/>
@@ -1081,8 +1103,10 @@
     </w:p>
     <w:p>
       <w:pPr>
+        <w:keepNext/>
         <w:spacing w:line="360" w:lineRule="auto"/>
         <w:jc w:val="both"/>
+        <w:outlineLvl w:val="0"/>
         <w:rPr>
           <w:b/>
           <w:bCs/>
@@ -1100,8 +1124,10 @@
     </w:p>
     <w:p>
       <w:pPr>
+        <w:keepNext/>
         <w:spacing w:line="360" w:lineRule="auto"/>
         <w:jc w:val="both"/>
+        <w:outlineLvl w:val="1"/>
         <w:rPr>
           <w:b/>
           <w:bCs/>
@@ -1243,8 +1269,10 @@
     </w:p>
     <w:p>
       <w:pPr>
+        <w:keepNext/>
         <w:spacing w:line="360" w:lineRule="auto"/>
         <w:jc w:val="both"/>
+        <w:outlineLvl w:val="1"/>
         <w:rPr>
           <w:b/>
           <w:bCs/>
@@ -1294,8 +1322,10 @@
     </w:p>
     <w:p>
       <w:pPr>
+        <w:keepNext/>
         <w:spacing w:line="360" w:lineRule="auto"/>
         <w:jc w:val="both"/>
+        <w:outlineLvl w:val="1"/>
         <w:rPr>
           <w:b/>
           <w:bCs/>
@@ -1338,8 +1368,10 @@
     </w:p>
     <w:p>
       <w:pPr>
+        <w:keepNext/>
         <w:spacing w:line="360" w:lineRule="auto"/>
         <w:jc w:val="both"/>
+        <w:outlineLvl w:val="1"/>
         <w:rPr>
           <w:b/>
           <w:bCs/>
@@ -1409,8 +1441,10 @@
     </w:p>
     <w:p>
       <w:pPr>
+        <w:keepNext/>
         <w:spacing w:line="360" w:lineRule="auto"/>
         <w:jc w:val="both"/>
+        <w:outlineLvl w:val="1"/>
         <w:rPr>
           <w:b/>
           <w:bCs/>
@@ -1471,8 +1505,10 @@
     </w:p>
     <w:p>
       <w:pPr>
+        <w:keepNext/>
         <w:spacing w:line="360" w:lineRule="auto"/>
         <w:jc w:val="both"/>
+        <w:outlineLvl w:val="0"/>
         <w:rPr>
           <w:b/>
           <w:bCs/>
@@ -1490,8 +1526,10 @@
     </w:p>
     <w:p>
       <w:pPr>
+        <w:keepNext/>
         <w:spacing w:line="360" w:lineRule="auto"/>
         <w:jc w:val="both"/>
+        <w:outlineLvl w:val="1"/>
         <w:rPr>
           <w:b/>
           <w:bCs/>
@@ -5220,8 +5258,10 @@
     </w:p>
     <w:p>
       <w:pPr>
+        <w:keepNext/>
         <w:spacing w:line="360" w:lineRule="auto"/>
         <w:jc w:val="both"/>
+        <w:outlineLvl w:val="1"/>
         <w:rPr>
           <w:b/>
           <w:bCs/>
@@ -12114,11 +12154,13 @@
     </w:p>
     <w:p>
       <w:pPr>
+        <w:keepNext/>
         <w:tabs>
           <w:tab w:val="left" w:pos="426"/>
         </w:tabs>
         <w:spacing w:line="360" w:lineRule="auto"/>
         <w:jc w:val="both"/>
+        <w:outlineLvl w:val="1"/>
         <w:rPr>
           <w:b/>
           <w:bCs/>
@@ -12140,11 +12182,13 @@
     </w:p>
     <w:p>
       <w:pPr>
+        <w:keepNext/>
         <w:tabs>
           <w:tab w:val="left" w:pos="426"/>
         </w:tabs>
         <w:spacing w:line="360" w:lineRule="auto"/>
         <w:jc w:val="both"/>
+        <w:outlineLvl w:val="2"/>
         <w:rPr>
           <w:b/>
           <w:bCs/>
@@ -13578,8 +13622,10 @@
     </w:p>
     <w:p>
       <w:pPr>
+        <w:keepNext/>
         <w:spacing w:line="360" w:lineRule="auto"/>
         <w:jc w:val="both"/>
+        <w:outlineLvl w:val="2"/>
         <w:rPr>
           <w:color w:val="000000" w:themeColor="text1"/>
         </w:rPr>
@@ -13618,8 +13664,10 @@
     </w:p>
     <w:p>
       <w:pPr>
+        <w:keepNext/>
         <w:spacing w:line="360" w:lineRule="auto"/>
         <w:jc w:val="both"/>
+        <w:outlineLvl w:val="2"/>
         <w:rPr>
           <w:color w:val="000000" w:themeColor="text1"/>
         </w:rPr>
@@ -13673,6 +13721,8 @@
     </w:p>
     <w:p>
       <w:pPr>
+        <w:keepNext/>
+        <w:outlineLvl w:val="1"/>
         <w:rPr>
           <w:b/>
           <w:bCs/>
@@ -13714,8 +13764,10 @@
     </w:p>
     <w:p>
       <w:pPr>
+        <w:keepNext/>
         <w:spacing w:line="360" w:lineRule="auto"/>
         <w:jc w:val="both"/>
+        <w:outlineLvl w:val="0"/>
         <w:rPr>
           <w:b/>
           <w:bCs/>
@@ -13792,8 +13844,10 @@
     </w:p>
     <w:p>
       <w:pPr>
+        <w:keepNext/>
         <w:spacing w:line="360" w:lineRule="auto"/>
         <w:jc w:val="both"/>
+        <w:outlineLvl w:val="0"/>
         <w:rPr>
           <w:b/>
           <w:bCs/>
@@ -13811,8 +13865,10 @@
     </w:p>
     <w:p>
       <w:pPr>
+        <w:keepNext/>
         <w:spacing w:line="360" w:lineRule="auto"/>
         <w:jc w:val="both"/>
+        <w:outlineLvl w:val="1"/>
         <w:rPr>
           <w:b/>
           <w:bCs/>
@@ -13890,8 +13946,10 @@
     </w:p>
     <w:p>
       <w:pPr>
+        <w:keepNext/>
         <w:spacing w:line="360" w:lineRule="auto"/>
         <w:jc w:val="both"/>
+        <w:outlineLvl w:val="1"/>
         <w:rPr>
           <w:b/>
           <w:bCs/>
@@ -13984,8 +14042,10 @@
     </w:p>
     <w:p>
       <w:pPr>
+        <w:keepNext/>
         <w:spacing w:line="360" w:lineRule="auto"/>
         <w:jc w:val="both"/>
+        <w:outlineLvl w:val="0"/>
         <w:rPr>
           <w:b/>
           <w:bCs/>
@@ -14148,9 +14208,11 @@
     </w:p>
     <w:p>
       <w:pPr>
+        <w:keepNext/>
         <w:spacing w:line="360" w:lineRule="auto"/>
         <w:ind w:left="720" w:hanging="720"/>
         <w:jc w:val="both"/>
+        <w:outlineLvl w:val="0"/>
         <w:rPr>
           <w:b/>
           <w:bCs/>

</xml_diff>